<commit_message>
Update default resume template
</commit_message>
<xml_diff>
--- a/assets/resume-template-ats.docx
+++ b/assets/resume-template-ats.docx
@@ -19,12 +19,12 @@
       </w:tblPr>
       <w:tblGrid>
         <w:gridCol w:w="1446"/>
-        <w:gridCol w:w="5642"/>
-        <w:gridCol w:w="3174"/>
+        <w:gridCol w:w="5925"/>
+        <w:gridCol w:w="2891"/>
       </w:tblGrid>
       <w:tr>
         <w:trPr>
-          <w:trHeight w:val="520"/>
+          <w:trHeight w:val="630"/>
           <w:jc w:val="center"/>
         </w:trPr>
         <w:tc>
@@ -45,7 +45,7 @@
                 <w:noProof/>
               </w:rPr>
               <w:drawing>
-                <wp:inline distT="0" distB="0" distL="0" distR="0" wp14:anchorId="306F8988" wp14:editId="41FC0604">
+                <wp:inline distT="0" distB="0" distL="0" distR="0" wp14:anchorId="177325CA" wp14:editId="377D789F">
                   <wp:extent cx="784800" cy="990000"/>
                   <wp:effectExtent l="0" t="0" r="0" b="0"/>
                   <wp:docPr id="1" name="Picture 1"/>
@@ -60,7 +60,7 @@
                           <pic:cNvPicPr/>
                         </pic:nvPicPr>
                         <pic:blipFill>
-                          <a:blip r:embed="rId8"/>
+                          <a:blip r:embed="rId7"/>
                           <a:stretch>
                             <a:fillRect/>
                           </a:stretch>
@@ -84,7 +84,7 @@
         </w:tc>
         <w:tc>
           <w:tcPr>
-            <w:tcW w:w="5642" w:type="dxa"/>
+            <w:tcW w:w="5925" w:type="dxa"/>
             <w:vMerge w:val="restart"/>
             <w:tcMar>
               <w:top w:w="0" w:type="dxa"/>
@@ -105,28 +105,25 @@
               <w:rPr>
                 <w:b/>
                 <w:color w:val="121212"/>
-                <w:sz w:val="44"/>
-                <w:lang w:eastAsia="zh-CN"/>
+                <w:sz w:val="54"/>
               </w:rPr>
-              <w:t>[姓 名]</w:t>
+              <w:t>[</w:t>
             </w:r>
             <w:r>
               <w:rPr>
                 <w:b/>
                 <w:color w:val="121212"/>
-                <w:sz w:val="44"/>
-                <w:lang w:eastAsia="zh-CN"/>
+                <w:sz w:val="54"/>
               </w:rPr>
-              <w:t xml:space="preserve"/>
+              <w:t>姓名</w:t>
             </w:r>
             <w:r>
               <w:rPr>
                 <w:b/>
                 <w:color w:val="121212"/>
-                <w:sz w:val="44"/>
-                <w:lang w:eastAsia="zh-CN"/>
+                <w:sz w:val="54"/>
               </w:rPr>
-              <w:t/>
+              <w:t>]</w:t>
             </w:r>
           </w:p>
           <w:p>
@@ -139,74 +136,74 @@
             <w:r>
               <w:rPr>
                 <w:b/>
-                <w:color w:val="1C4970"/>
-                <w:sz w:val="22"/>
-                <w:lang w:eastAsia="zh-CN"/>
+                <w:color w:val="1F4E79"/>
+                <w:sz w:val="26"/>
               </w:rPr>
-              <w:t>[岗位方向]  [核心技能]  [行业关键词]</w:t>
+              <w:t>[</w:t>
             </w:r>
             <w:r>
               <w:rPr>
                 <w:b/>
-                <w:color w:val="1C4970"/>
-                <w:sz w:val="22"/>
-                <w:lang w:eastAsia="zh-CN"/>
+                <w:color w:val="1F4E79"/>
+                <w:sz w:val="26"/>
               </w:rPr>
-              <w:t/>
+              <w:t>专业方向</w:t>
             </w:r>
             <w:r>
               <w:rPr>
                 <w:b/>
-                <w:color w:val="1C4970"/>
-                <w:sz w:val="22"/>
-                <w:lang w:eastAsia="zh-CN"/>
+                <w:color w:val="1F4E79"/>
+                <w:sz w:val="26"/>
               </w:rPr>
-              <w:t xml:space="preserve"/>
+              <w:t>]  [</w:t>
             </w:r>
             <w:r>
               <w:rPr>
                 <w:b/>
-                <w:color w:val="1C4970"/>
-                <w:sz w:val="22"/>
-                <w:lang w:eastAsia="zh-CN"/>
+                <w:color w:val="1F4E79"/>
+                <w:sz w:val="26"/>
               </w:rPr>
-              <w:t/>
+              <w:t>行业关键词</w:t>
             </w:r>
             <w:r>
               <w:rPr>
                 <w:b/>
-                <w:color w:val="1C4970"/>
-                <w:sz w:val="22"/>
-                <w:lang w:eastAsia="zh-CN"/>
+                <w:color w:val="1F4E79"/>
+                <w:sz w:val="26"/>
               </w:rPr>
-              <w:t xml:space="preserve"/>
+              <w:t>]  [</w:t>
             </w:r>
             <w:r>
               <w:rPr>
                 <w:b/>
-                <w:color w:val="1C4970"/>
-                <w:sz w:val="22"/>
-                <w:lang w:eastAsia="zh-CN"/>
+                <w:color w:val="1F4E79"/>
+                <w:sz w:val="26"/>
               </w:rPr>
-              <w:t/>
+              <w:t>核心能力</w:t>
             </w:r>
             <w:r>
               <w:rPr>
                 <w:b/>
-                <w:color w:val="1C4970"/>
-                <w:sz w:val="22"/>
-                <w:lang w:eastAsia="zh-CN"/>
+                <w:color w:val="1F4E79"/>
+                <w:sz w:val="26"/>
               </w:rPr>
-              <w:t xml:space="preserve"/>
+              <w:t>]  [</w:t>
             </w:r>
             <w:r>
               <w:rPr>
                 <w:b/>
-                <w:color w:val="1C4970"/>
-                <w:sz w:val="22"/>
-                <w:lang w:eastAsia="zh-CN"/>
+                <w:color w:val="1F4E79"/>
+                <w:sz w:val="26"/>
               </w:rPr>
-              <w:t/>
+              <w:t>岗位关键词</w:t>
+            </w:r>
+            <w:r>
+              <w:rPr>
+                <w:b/>
+                <w:color w:val="1F4E79"/>
+                <w:sz w:val="26"/>
+              </w:rPr>
+              <w:t>]</w:t>
             </w:r>
           </w:p>
           <w:p>
@@ -217,137 +214,86 @@
             </w:pPr>
             <w:r>
               <w:rPr>
-                <w:color w:val="5E5E5E"/>
-                <w:sz w:val="19"/>
-                <w:lang w:eastAsia="zh-CN"/>
+                <w:color w:val="666666"/>
+                <w:sz w:val="21"/>
               </w:rPr>
-              <w:t>[学历/年限]  |  [所在地]  |  [其他信息]  |  [语言/证书]</w:t>
+              <w:t>[</w:t>
             </w:r>
             <w:r>
               <w:rPr>
-                <w:color w:val="5E5E5E"/>
-                <w:sz w:val="19"/>
-                <w:lang w:eastAsia="zh-CN"/>
+                <w:color w:val="666666"/>
+                <w:sz w:val="21"/>
               </w:rPr>
-              <w:t/>
+              <w:t>学历</w:t>
             </w:r>
             <w:r>
               <w:rPr>
-                <w:color w:val="5E5E5E"/>
-                <w:sz w:val="19"/>
-                <w:lang w:eastAsia="zh-CN"/>
+                <w:color w:val="666666"/>
+                <w:sz w:val="21"/>
               </w:rPr>
-              <w:t xml:space="preserve"/>
+              <w:t>/</w:t>
             </w:r>
             <w:r>
               <w:rPr>
-                <w:color w:val="5E5E5E"/>
-                <w:sz w:val="19"/>
-                <w:lang w:eastAsia="zh-CN"/>
+                <w:color w:val="666666"/>
+                <w:sz w:val="21"/>
               </w:rPr>
-              <w:t/>
+              <w:t>届别</w:t>
             </w:r>
             <w:r>
               <w:rPr>
-                <w:color w:val="5E5E5E"/>
-                <w:sz w:val="19"/>
-                <w:lang w:eastAsia="zh-CN"/>
+                <w:color w:val="666666"/>
+                <w:sz w:val="21"/>
               </w:rPr>
-              <w:t xml:space="preserve"/>
+              <w:t>]  |  [</w:t>
             </w:r>
             <w:r>
               <w:rPr>
-                <w:color w:val="5E5E5E"/>
-                <w:sz w:val="19"/>
-                <w:lang w:eastAsia="zh-CN"/>
+                <w:color w:val="666666"/>
+                <w:sz w:val="21"/>
               </w:rPr>
-              <w:t/>
+              <w:t>其他信息</w:t>
             </w:r>
             <w:r>
               <w:rPr>
-                <w:color w:val="5E5E5E"/>
-                <w:sz w:val="19"/>
-                <w:lang w:eastAsia="zh-CN"/>
+                <w:color w:val="666666"/>
+                <w:sz w:val="21"/>
               </w:rPr>
-              <w:t xml:space="preserve"/>
+              <w:t>]  |  [</w:t>
             </w:r>
             <w:r>
               <w:rPr>
-                <w:rFonts w:hint="eastAsia"/>
-                <w:color w:val="5E5E5E"/>
-                <w:sz w:val="19"/>
-                <w:lang w:eastAsia="zh-CN"/>
+                <w:color w:val="666666"/>
+                <w:sz w:val="21"/>
               </w:rPr>
-              <w:t/>
+              <w:t>语言</w:t>
             </w:r>
             <w:r>
               <w:rPr>
-                <w:rFonts w:hint="eastAsia"/>
-                <w:color w:val="5E5E5E"/>
-                <w:sz w:val="19"/>
-                <w:lang w:eastAsia="zh-CN"/>
+                <w:color w:val="666666"/>
+                <w:sz w:val="21"/>
               </w:rPr>
-              <w:t/>
+              <w:t>/</w:t>
+            </w:r>
+            <w:r>
+              <w:rPr>
+                <w:color w:val="666666"/>
+                <w:sz w:val="21"/>
+              </w:rPr>
+              <w:t>证书</w:t>
+            </w:r>
+            <w:r>
+              <w:rPr>
+                <w:color w:val="666666"/>
+                <w:sz w:val="21"/>
+              </w:rPr>
+              <w:t>]</w:t>
             </w:r>
           </w:p>
         </w:tc>
         <w:tc>
           <w:tcPr>
-            <w:tcW w:w="3174" w:type="dxa"/>
-            <w:tcMar>
-              <w:top w:w="0" w:type="dxa"/>
-              <w:left w:w="35" w:type="dxa"/>
-              <w:bottom w:w="0" w:type="dxa"/>
-              <w:right w:w="35" w:type="dxa"/>
-            </w:tcMar>
-          </w:tcPr>
-          <w:p>
-            <w:pPr>
-              <w:spacing w:after="14"/>
-              <w:ind w:right="1140"/>
-              <w:jc w:val="both"/>
-              <w:rPr>
-                <w:sz w:val="22"/>
-                <w:lang w:eastAsia="zh-CN"/>
-              </w:rPr>
-            </w:pPr>
-            <w:r>
-              <w:rPr>
-                <w:color w:val="121212"/>
-                <w:sz w:val="22"/>
-                <w:lang w:eastAsia="zh-CN"/>
-              </w:rPr>
-              <w:t>电话</w:t>
-            </w:r>
-            <w:r>
-              <w:rPr>
-                <w:color w:val="121212"/>
-                <w:sz w:val="22"/>
-                <w:lang w:eastAsia="zh-CN"/>
-              </w:rPr>
-              <w:t xml:space="preserve">  [手机号]</w:t>
-            </w:r>
-          </w:p>
-          <w:p>
-            <w:pPr>
-              <w:jc w:val="both"/>
-              <w:rPr>
-                <w:sz w:val="22"/>
-                <w:lang w:eastAsia="zh-CN"/>
-              </w:rPr>
-            </w:pPr>
-          </w:p>
-        </w:tc>
-      </w:tr>
-      <w:tr>
-        <w:trPr>
-          <w:trHeight w:val="520"/>
-          <w:jc w:val="center"/>
-        </w:trPr>
-        <w:tc>
-          <w:tcPr>
-            <w:tcW w:w="1446" w:type="dxa"/>
-            <w:vMerge/>
+            <w:tcW w:w="2891" w:type="dxa"/>
             <w:tcMar>
               <w:top w:w="0" w:type="dxa"/>
               <w:left w:w="35" w:type="dxa"/>
@@ -358,80 +304,45 @@
           </w:tcPr>
           <w:p>
             <w:pPr>
-              <w:rPr>
-                <w:noProof/>
-                <w:lang w:eastAsia="zh-CN"/>
-              </w:rPr>
-            </w:pPr>
-          </w:p>
-        </w:tc>
-        <w:tc>
-          <w:tcPr>
-            <w:tcW w:w="5642" w:type="dxa"/>
-            <w:vMerge/>
-            <w:tcMar>
-              <w:top w:w="0" w:type="dxa"/>
-              <w:left w:w="35" w:type="dxa"/>
-              <w:bottom w:w="0" w:type="dxa"/>
-              <w:right w:w="35" w:type="dxa"/>
-            </w:tcMar>
-            <w:vAlign w:val="center"/>
-          </w:tcPr>
-          <w:p>
-            <w:pPr>
-              <w:spacing w:after="16"/>
-              <w:rPr>
-                <w:b/>
-                <w:color w:val="121212"/>
-                <w:sz w:val="44"/>
-                <w:lang w:eastAsia="zh-CN"/>
-              </w:rPr>
-            </w:pPr>
-          </w:p>
-        </w:tc>
-        <w:tc>
-          <w:tcPr>
-            <w:tcW w:w="3174" w:type="dxa"/>
-            <w:tcMar>
-              <w:top w:w="0" w:type="dxa"/>
-              <w:left w:w="35" w:type="dxa"/>
-              <w:bottom w:w="0" w:type="dxa"/>
-              <w:right w:w="35" w:type="dxa"/>
-            </w:tcMar>
-          </w:tcPr>
-          <w:p>
-            <w:pPr>
               <w:spacing w:after="14"/>
               <w:jc w:val="both"/>
               <w:rPr>
-                <w:sz w:val="22"/>
                 <w:lang w:eastAsia="zh-CN"/>
               </w:rPr>
             </w:pPr>
             <w:r>
               <w:rPr>
                 <w:color w:val="121212"/>
-                <w:sz w:val="22"/>
-                <w:lang w:eastAsia="zh-CN"/>
+                <w:sz w:val="21"/>
               </w:rPr>
-              <w:t>邮箱</w:t>
+              <w:t>电话</w:t>
             </w:r>
             <w:r>
               <w:rPr>
                 <w:color w:val="121212"/>
-                <w:sz w:val="22"/>
-                <w:lang w:eastAsia="zh-CN"/>
+                <w:sz w:val="21"/>
               </w:rPr>
-              <w:t xml:space="preserve">  [邮箱]</w:t>
+              <w:t xml:space="preserve">  [</w:t>
+            </w:r>
+            <w:r>
+              <w:rPr>
+                <w:color w:val="121212"/>
+                <w:sz w:val="21"/>
+              </w:rPr>
+              <w:t>手机号</w:t>
+            </w:r>
+            <w:r>
+              <w:rPr>
+                <w:color w:val="121212"/>
+                <w:sz w:val="21"/>
+              </w:rPr>
+              <w:t>]</w:t>
             </w:r>
           </w:p>
           <w:p>
             <w:pPr>
-              <w:spacing w:after="14"/>
               <w:jc w:val="both"/>
               <w:rPr>
-                <w:color w:val="121212"/>
-                <w:sz w:val="22"/>
                 <w:lang w:eastAsia="zh-CN"/>
               </w:rPr>
             </w:pPr>
@@ -440,7 +351,7 @@
       </w:tr>
       <w:tr>
         <w:trPr>
-          <w:trHeight w:val="520"/>
+          <w:trHeight w:val="630"/>
           <w:jc w:val="center"/>
         </w:trPr>
         <w:tc>
@@ -465,7 +376,7 @@
         </w:tc>
         <w:tc>
           <w:tcPr>
-            <w:tcW w:w="5642" w:type="dxa"/>
+            <w:tcW w:w="5925" w:type="dxa"/>
             <w:vMerge/>
             <w:tcMar>
               <w:top w:w="0" w:type="dxa"/>
@@ -481,7 +392,7 @@
               <w:rPr>
                 <w:b/>
                 <w:color w:val="121212"/>
-                <w:sz w:val="44"/>
+                <w:sz w:val="54"/>
                 <w:lang w:eastAsia="zh-CN"/>
               </w:rPr>
             </w:pPr>
@@ -489,13 +400,124 @@
         </w:tc>
         <w:tc>
           <w:tcPr>
-            <w:tcW w:w="3174" w:type="dxa"/>
+            <w:tcW w:w="2891" w:type="dxa"/>
             <w:tcMar>
               <w:top w:w="0" w:type="dxa"/>
               <w:left w:w="35" w:type="dxa"/>
               <w:bottom w:w="0" w:type="dxa"/>
               <w:right w:w="35" w:type="dxa"/>
             </w:tcMar>
+            <w:vAlign w:val="center"/>
+          </w:tcPr>
+          <w:p>
+            <w:pPr>
+              <w:spacing w:after="14"/>
+              <w:jc w:val="both"/>
+              <w:rPr>
+                <w:lang w:eastAsia="zh-CN"/>
+              </w:rPr>
+            </w:pPr>
+            <w:r>
+              <w:rPr>
+                <w:color w:val="121212"/>
+                <w:sz w:val="21"/>
+              </w:rPr>
+              <w:t>邮箱</w:t>
+            </w:r>
+            <w:r>
+              <w:rPr>
+                <w:color w:val="121212"/>
+                <w:sz w:val="21"/>
+              </w:rPr>
+              <w:t xml:space="preserve">  [</w:t>
+            </w:r>
+            <w:r>
+              <w:rPr>
+                <w:color w:val="121212"/>
+                <w:sz w:val="21"/>
+              </w:rPr>
+              <w:t>邮箱</w:t>
+            </w:r>
+            <w:r>
+              <w:rPr>
+                <w:color w:val="121212"/>
+                <w:sz w:val="21"/>
+              </w:rPr>
+              <w:t>]</w:t>
+            </w:r>
+          </w:p>
+          <w:p>
+            <w:pPr>
+              <w:spacing w:after="14"/>
+              <w:jc w:val="both"/>
+              <w:rPr>
+                <w:color w:val="121212"/>
+                <w:sz w:val="21"/>
+                <w:lang w:eastAsia="zh-CN"/>
+              </w:rPr>
+            </w:pPr>
+          </w:p>
+        </w:tc>
+      </w:tr>
+      <w:tr>
+        <w:trPr>
+          <w:trHeight w:val="630"/>
+          <w:jc w:val="center"/>
+        </w:trPr>
+        <w:tc>
+          <w:tcPr>
+            <w:tcW w:w="1446" w:type="dxa"/>
+            <w:vMerge/>
+            <w:tcMar>
+              <w:top w:w="0" w:type="dxa"/>
+              <w:left w:w="35" w:type="dxa"/>
+              <w:bottom w:w="0" w:type="dxa"/>
+              <w:right w:w="35" w:type="dxa"/>
+            </w:tcMar>
+            <w:vAlign w:val="center"/>
+          </w:tcPr>
+          <w:p>
+            <w:pPr>
+              <w:rPr>
+                <w:noProof/>
+              </w:rPr>
+            </w:pPr>
+          </w:p>
+        </w:tc>
+        <w:tc>
+          <w:tcPr>
+            <w:tcW w:w="5925" w:type="dxa"/>
+            <w:vMerge/>
+            <w:tcMar>
+              <w:top w:w="0" w:type="dxa"/>
+              <w:left w:w="35" w:type="dxa"/>
+              <w:bottom w:w="0" w:type="dxa"/>
+              <w:right w:w="35" w:type="dxa"/>
+            </w:tcMar>
+            <w:vAlign w:val="center"/>
+          </w:tcPr>
+          <w:p>
+            <w:pPr>
+              <w:spacing w:after="16"/>
+              <w:rPr>
+                <w:b/>
+                <w:color w:val="121212"/>
+                <w:sz w:val="54"/>
+                <w:lang w:eastAsia="zh-CN"/>
+              </w:rPr>
+            </w:pPr>
+          </w:p>
+        </w:tc>
+        <w:tc>
+          <w:tcPr>
+            <w:tcW w:w="2891" w:type="dxa"/>
+            <w:tcMar>
+              <w:top w:w="0" w:type="dxa"/>
+              <w:left w:w="35" w:type="dxa"/>
+              <w:bottom w:w="0" w:type="dxa"/>
+              <w:right w:w="35" w:type="dxa"/>
+            </w:tcMar>
+            <w:vAlign w:val="center"/>
           </w:tcPr>
           <w:p>
             <w:pPr>
@@ -503,36 +525,41 @@
               <w:jc w:val="both"/>
               <w:rPr>
                 <w:color w:val="121212"/>
-                <w:sz w:val="22"/>
+                <w:sz w:val="21"/>
                 <w:lang w:eastAsia="zh-CN"/>
               </w:rPr>
             </w:pPr>
             <w:r>
               <w:rPr>
                 <w:b/>
-                <w:color w:val="1C4970"/>
-                <w:sz w:val="22"/>
-                <w:lang w:eastAsia="zh-CN"/>
+                <w:color w:val="1F4E79"/>
+                <w:sz w:val="21"/>
               </w:rPr>
               <w:t>求职方向</w:t>
             </w:r>
             <w:r>
               <w:rPr>
                 <w:b/>
-                <w:color w:val="1C4970"/>
-                <w:sz w:val="22"/>
-                <w:lang w:eastAsia="zh-CN"/>
+                <w:color w:val="1F4E79"/>
+                <w:sz w:val="21"/>
               </w:rPr>
-              <w:t xml:space="preserve">  </w:t>
+              <w:t xml:space="preserve">  [</w:t>
             </w:r>
             <w:r>
               <w:rPr>
                 <w:b/>
-                <w:color w:val="1C4970"/>
-                <w:sz w:val="22"/>
-                <w:lang w:eastAsia="zh-CN"/>
+                <w:color w:val="1F4E79"/>
+                <w:sz w:val="21"/>
               </w:rPr>
-              <w:t>[目标岗位]</w:t>
+              <w:t>目标岗位</w:t>
+            </w:r>
+            <w:r>
+              <w:rPr>
+                <w:b/>
+                <w:color w:val="1F4E79"/>
+                <w:sz w:val="21"/>
+              </w:rPr>
+              <w:t>]</w:t>
             </w:r>
           </w:p>
         </w:tc>
@@ -551,28 +578,16 @@
           <w:b/>
           <w:color w:val="1C4970"/>
           <w:sz w:val="22"/>
-          <w:lang w:eastAsia="zh-CN"/>
         </w:rPr>
         <w:t>▌</w:t>
       </w:r>
       <w:r>
         <w:rPr>
-          <w:rFonts w:hint="eastAsia"/>
           <w:b/>
           <w:color w:val="121212"/>
           <w:sz w:val="23"/>
-          <w:lang w:eastAsia="zh-CN"/>
-        </w:rPr>
-        <w:t>个人</w:t>
-      </w:r>
-      <w:r>
-        <w:rPr>
-          <w:b/>
-          <w:color w:val="121212"/>
-          <w:sz w:val="23"/>
-          <w:lang w:eastAsia="zh-CN"/>
-        </w:rPr>
-        <w:t>概述</w:t>
+        </w:rPr>
+        <w:t>个人概述</w:t>
       </w:r>
     </w:p>
     <w:p>
@@ -585,61 +600,44 @@
       <w:r>
         <w:rPr>
           <w:color w:val="343434"/>
-          <w:lang w:eastAsia="zh-CN"/>
-        </w:rPr>
-        <w:t>[用2至3项最强证据概括专业背景、核心能力与目标岗位价值。]</w:t>
+        </w:rPr>
+        <w:t>[</w:t>
       </w:r>
       <w:r>
         <w:rPr>
           <w:color w:val="343434"/>
-          <w:lang w:eastAsia="zh-CN"/>
-        </w:rPr>
-        <w:t/>
+        </w:rPr>
+        <w:t>用</w:t>
       </w:r>
       <w:r>
         <w:rPr>
           <w:color w:val="343434"/>
-          <w:lang w:eastAsia="zh-CN"/>
-        </w:rPr>
-        <w:t/>
+        </w:rPr>
+        <w:t>2</w:t>
       </w:r>
       <w:r>
         <w:rPr>
           <w:color w:val="343434"/>
-          <w:lang w:eastAsia="zh-CN"/>
-        </w:rPr>
-        <w:t/>
+        </w:rPr>
+        <w:t>至</w:t>
       </w:r>
       <w:r>
         <w:rPr>
           <w:color w:val="343434"/>
-          <w:lang w:eastAsia="zh-CN"/>
-        </w:rPr>
-        <w:t/>
-      </w:r>
-      <w:r>
-        <w:rPr>
-          <w:rFonts w:hint="eastAsia"/>
+        </w:rPr>
+        <w:t>3</w:t>
+      </w:r>
+      <w:r>
+        <w:rPr>
           <w:color w:val="343434"/>
-          <w:lang w:eastAsia="zh-CN"/>
-        </w:rPr>
-        <w:t/>
-      </w:r>
-      <w:r>
-        <w:rPr>
-          <w:rFonts w:hint="eastAsia"/>
+        </w:rPr>
+        <w:t>项最强证据概括专业背景、核心能力与目标岗位价值。</w:t>
+      </w:r>
+      <w:r>
+        <w:rPr>
           <w:color w:val="343434"/>
-          <w:lang w:eastAsia="zh-CN"/>
-        </w:rPr>
-        <w:t/>
-      </w:r>
-      <w:r>
-        <w:rPr>
-          <w:rFonts w:hint="eastAsia"/>
-          <w:color w:val="343434"/>
-          <w:lang w:eastAsia="zh-CN"/>
-        </w:rPr>
-        <w:t/>
+        </w:rPr>
+        <w:t>]</w:t>
       </w:r>
     </w:p>
     <w:p>
@@ -655,7 +653,6 @@
           <w:b/>
           <w:color w:val="1C4970"/>
           <w:sz w:val="22"/>
-          <w:lang w:eastAsia="zh-CN"/>
         </w:rPr>
         <w:t>▌</w:t>
       </w:r>
@@ -664,7 +661,6 @@
           <w:b/>
           <w:color w:val="121212"/>
           <w:sz w:val="23"/>
-          <w:lang w:eastAsia="zh-CN"/>
         </w:rPr>
         <w:t>教育背景</w:t>
       </w:r>
@@ -675,7 +671,7 @@
         <w:tabs>
           <w:tab w:val="right" w:pos="10220"/>
         </w:tabs>
-        <w:spacing w:before="14" w:after="2"/>
+        <w:spacing w:before="12" w:after="2"/>
         <w:rPr>
           <w:lang w:eastAsia="zh-CN"/>
         </w:rPr>
@@ -683,67 +679,122 @@
       <w:r>
         <w:rPr>
           <w:b/>
-          <w:color w:val="000000"/>
-          <w:lang w:eastAsia="zh-CN"/>
-        </w:rPr>
-        <w:t>[学校名称1]</w:t>
+          <w:color w:val="121212"/>
+        </w:rPr>
+        <w:t>[</w:t>
       </w:r>
       <w:r>
         <w:rPr>
           <w:b/>
-          <w:color w:val="000000"/>
-          <w:lang w:eastAsia="zh-CN"/>
-        </w:rPr>
-        <w:t xml:space="preserve">  </w:t>
+          <w:color w:val="121212"/>
+        </w:rPr>
+        <w:t>学校名称</w:t>
       </w:r>
       <w:r>
         <w:rPr>
           <w:b/>
-          <w:color w:val="000000"/>
-          <w:lang w:eastAsia="zh-CN"/>
-        </w:rPr>
-        <w:t>[专业]</w:t>
+          <w:color w:val="121212"/>
+        </w:rPr>
+        <w:t>1]  [</w:t>
       </w:r>
       <w:r>
         <w:rPr>
           <w:b/>
-          <w:color w:val="000000"/>
-          <w:lang w:eastAsia="zh-CN"/>
-        </w:rPr>
-        <w:t xml:space="preserve">  </w:t>
+          <w:color w:val="121212"/>
+        </w:rPr>
+        <w:t>专业</w:t>
       </w:r>
       <w:r>
         <w:rPr>
           <w:b/>
-          <w:color w:val="000000"/>
-          <w:lang w:eastAsia="zh-CN"/>
-        </w:rPr>
-        <w:t>[学历/学位]</w:t>
+          <w:color w:val="121212"/>
+        </w:rPr>
+        <w:t>]  [</w:t>
       </w:r>
       <w:r>
         <w:rPr>
           <w:b/>
-          <w:color w:val="000000"/>
-          <w:lang w:eastAsia="zh-CN"/>
-        </w:rPr>
-        <w:t/>
+          <w:color w:val="121212"/>
+        </w:rPr>
+        <w:t>学历</w:t>
       </w:r>
       <w:r>
         <w:rPr>
           <w:b/>
-          <w:color w:val="000000"/>
-          <w:lang w:eastAsia="zh-CN"/>
-        </w:rPr>
-        <w:t/>
+          <w:color w:val="121212"/>
+        </w:rPr>
+        <w:t>/</w:t>
       </w:r>
       <w:r>
         <w:rPr>
           <w:b/>
-          <w:color w:val="000000"/>
-          <w:lang w:eastAsia="zh-CN"/>
+          <w:color w:val="121212"/>
+        </w:rPr>
+        <w:t>学位</w:t>
+      </w:r>
+      <w:r>
+        <w:rPr>
+          <w:b/>
+          <w:color w:val="121212"/>
+        </w:rPr>
+        <w:t>]</w:t>
+      </w:r>
+      <w:r>
+        <w:rPr>
+          <w:b/>
+          <w:color w:val="1F4E79"/>
+        </w:rPr>
+        <w:t xml:space="preserve">  [</w:t>
+      </w:r>
+      <w:r>
+        <w:rPr>
+          <w:b/>
+          <w:color w:val="1F4E79"/>
+        </w:rPr>
+        <w:t>语言</w:t>
+      </w:r>
+      <w:r>
+        <w:rPr>
+          <w:b/>
+          <w:color w:val="1F4E79"/>
+        </w:rPr>
+        <w:t>/</w:t>
+      </w:r>
+      <w:r>
+        <w:rPr>
+          <w:b/>
+          <w:color w:val="1F4E79"/>
+        </w:rPr>
+        <w:t>证书</w:t>
+      </w:r>
+      <w:r>
+        <w:rPr>
+          <w:b/>
+          <w:color w:val="1F4E79"/>
+        </w:rPr>
+        <w:t>]</w:t>
+      </w:r>
+      <w:r>
+        <w:rPr>
+          <w:b/>
+          <w:color w:val="121212"/>
         </w:rPr>
         <w:tab/>
-        <w:t>[起止时间]</w:t>
+        <w:t>[</w:t>
+      </w:r>
+      <w:r>
+        <w:rPr>
+          <w:b/>
+          <w:color w:val="121212"/>
+        </w:rPr>
+        <w:t>起止时间</w:t>
+      </w:r>
+      <w:r>
+        <w:rPr>
+          <w:b/>
+          <w:color w:val="121212"/>
+        </w:rPr>
+        <w:t>]</w:t>
       </w:r>
     </w:p>
     <w:p>
@@ -752,7 +803,7 @@
         <w:tabs>
           <w:tab w:val="right" w:pos="10220"/>
         </w:tabs>
-        <w:spacing w:before="14" w:after="2"/>
+        <w:spacing w:before="12" w:after="2"/>
         <w:rPr>
           <w:lang w:eastAsia="zh-CN"/>
         </w:rPr>
@@ -761,66 +812,86 @@
         <w:rPr>
           <w:b/>
           <w:color w:val="121212"/>
-          <w:lang w:eastAsia="zh-CN"/>
-        </w:rPr>
-        <w:t>[学校名称2]</w:t>
+        </w:rPr>
+        <w:t>[</w:t>
       </w:r>
       <w:r>
         <w:rPr>
           <w:b/>
           <w:color w:val="121212"/>
-          <w:lang w:eastAsia="zh-CN"/>
-        </w:rPr>
-        <w:t xml:space="preserve">  </w:t>
+        </w:rPr>
+        <w:t>学校名称</w:t>
       </w:r>
       <w:r>
         <w:rPr>
           <w:b/>
           <w:color w:val="121212"/>
-          <w:lang w:eastAsia="zh-CN"/>
-        </w:rPr>
-        <w:t>[专业]</w:t>
+        </w:rPr>
+        <w:t>2]  [</w:t>
       </w:r>
       <w:r>
         <w:rPr>
           <w:b/>
           <w:color w:val="121212"/>
-          <w:lang w:eastAsia="zh-CN"/>
-        </w:rPr>
-        <w:t xml:space="preserve">  </w:t>
+        </w:rPr>
+        <w:t>专业</w:t>
       </w:r>
       <w:r>
         <w:rPr>
           <w:b/>
           <w:color w:val="121212"/>
-          <w:lang w:eastAsia="zh-CN"/>
-        </w:rPr>
-        <w:t>[学历/学位]</w:t>
+        </w:rPr>
+        <w:t>]  [</w:t>
       </w:r>
       <w:r>
         <w:rPr>
           <w:b/>
           <w:color w:val="121212"/>
-          <w:lang w:eastAsia="zh-CN"/>
-        </w:rPr>
-        <w:t/>
+        </w:rPr>
+        <w:t>学历</w:t>
       </w:r>
       <w:r>
         <w:rPr>
           <w:b/>
           <w:color w:val="121212"/>
-          <w:lang w:eastAsia="zh-CN"/>
-        </w:rPr>
-        <w:t/>
+        </w:rPr>
+        <w:t>/</w:t>
       </w:r>
       <w:r>
         <w:rPr>
           <w:b/>
           <w:color w:val="121212"/>
-          <w:lang w:eastAsia="zh-CN"/>
+        </w:rPr>
+        <w:t>学位</w:t>
+      </w:r>
+      <w:r>
+        <w:rPr>
+          <w:b/>
+          <w:color w:val="121212"/>
+        </w:rPr>
+        <w:t>]</w:t>
+      </w:r>
+      <w:r>
+        <w:rPr>
+          <w:b/>
+          <w:color w:val="121212"/>
         </w:rPr>
         <w:tab/>
-        <w:t>[起止时间]</w:t>
+        <w:t>[</w:t>
+      </w:r>
+      <w:r>
+        <w:rPr>
+          <w:b/>
+          <w:color w:val="121212"/>
+        </w:rPr>
+        <w:t>起止时间</w:t>
+      </w:r>
+      <w:r>
+        <w:rPr>
+          <w:b/>
+          <w:color w:val="121212"/>
+        </w:rPr>
+        <w:t>]</w:t>
       </w:r>
     </w:p>
     <w:p>
@@ -834,7 +905,6 @@
         <w:rPr>
           <w:b/>
           <w:color w:val="121212"/>
-          <w:lang w:eastAsia="zh-CN"/>
         </w:rPr>
         <w:t>相关课程</w:t>
       </w:r>
@@ -842,46 +912,74 @@
         <w:rPr>
           <w:b/>
           <w:color w:val="121212"/>
-          <w:lang w:eastAsia="zh-CN"/>
         </w:rPr>
         <w:t xml:space="preserve">  </w:t>
       </w:r>
       <w:r>
         <w:rPr>
           <w:color w:val="343434"/>
-          <w:lang w:eastAsia="zh-CN"/>
-        </w:rPr>
-        <w:t>[课程1、课程2、课程3；按JD筛选]</w:t>
-      </w:r>
-      <w:r>
-        <w:rPr>
-          <w:rFonts w:hint="eastAsia"/>
+        </w:rPr>
+        <w:t>[</w:t>
+      </w:r>
+      <w:r>
+        <w:rPr>
           <w:color w:val="343434"/>
-          <w:lang w:eastAsia="zh-CN"/>
-        </w:rPr>
-        <w:t/>
+        </w:rPr>
+        <w:t>课程</w:t>
       </w:r>
       <w:r>
         <w:rPr>
           <w:color w:val="343434"/>
-          <w:lang w:eastAsia="zh-CN"/>
-        </w:rPr>
-        <w:t/>
-      </w:r>
-      <w:r>
-        <w:rPr>
-          <w:rFonts w:hint="eastAsia"/>
+        </w:rPr>
+        <w:t>1</w:t>
+      </w:r>
+      <w:r>
+        <w:rPr>
           <w:color w:val="343434"/>
-          <w:lang w:eastAsia="zh-CN"/>
-        </w:rPr>
-        <w:t/>
+        </w:rPr>
+        <w:t>、课程</w:t>
       </w:r>
       <w:r>
         <w:rPr>
           <w:color w:val="343434"/>
-          <w:lang w:eastAsia="zh-CN"/>
-        </w:rPr>
-        <w:t/>
+        </w:rPr>
+        <w:t>2</w:t>
+      </w:r>
+      <w:r>
+        <w:rPr>
+          <w:color w:val="343434"/>
+        </w:rPr>
+        <w:t>、课程</w:t>
+      </w:r>
+      <w:r>
+        <w:rPr>
+          <w:color w:val="343434"/>
+        </w:rPr>
+        <w:t>3</w:t>
+      </w:r>
+      <w:r>
+        <w:rPr>
+          <w:color w:val="343434"/>
+        </w:rPr>
+        <w:t>；按</w:t>
+      </w:r>
+      <w:r>
+        <w:rPr>
+          <w:color w:val="343434"/>
+        </w:rPr>
+        <w:t>JD</w:t>
+      </w:r>
+      <w:r>
+        <w:rPr>
+          <w:color w:val="343434"/>
+        </w:rPr>
+        <w:t>筛选</w:t>
+      </w:r>
+      <w:r>
+        <w:rPr>
+          <w:color w:val="343434"/>
+        </w:rPr>
+        <w:t>]</w:t>
       </w:r>
     </w:p>
     <w:p>
@@ -897,167 +995,51 @@
         </w:rPr>
         <w:t>▌</w:t>
       </w:r>
-      <w:proofErr w:type="spellStart"/>
       <w:r>
         <w:rPr>
           <w:b/>
           <w:color w:val="121212"/>
           <w:sz w:val="23"/>
         </w:rPr>
-        <w:t>技术能力</w:t>
-      </w:r>
-      <w:proofErr w:type="spellEnd"/>
+        <w:t>核心能力</w:t>
+      </w:r>
     </w:p>
     <w:p>
       <w:pPr>
         <w:keepLines/>
         <w:spacing w:after="1"/>
       </w:pPr>
-      <w:proofErr w:type="spellStart"/>
       <w:r>
         <w:rPr>
           <w:b/>
-          <w:color w:val="000000"/>
+          <w:color w:val="121212"/>
         </w:rPr>
         <w:t>专业工具</w:t>
       </w:r>
-      <w:proofErr w:type="spellEnd"/>
       <w:r>
         <w:rPr>
           <w:b/>
-          <w:color w:val="000000"/>
+          <w:color w:val="121212"/>
         </w:rPr>
         <w:t xml:space="preserve">  </w:t>
       </w:r>
-      <w:proofErr w:type="spellStart"/>
-      <w:r>
-        <w:rPr>
-          <w:color w:val="000000"/>
-        </w:rPr>
-        <w:t>[软件、工具、语言；仅保留有证据的内容]</w:t>
-      </w:r>
-      <w:r>
-        <w:rPr>
-          <w:color w:val="000000"/>
-        </w:rPr>
-        <w:t/>
-      </w:r>
-      <w:r>
-        <w:rPr>
-          <w:color w:val="000000"/>
-        </w:rPr>
-        <w:t/>
-      </w:r>
-      <w:r>
-        <w:rPr>
-          <w:color w:val="000000"/>
-        </w:rPr>
-        <w:t/>
-      </w:r>
-      <w:r>
-        <w:rPr>
-          <w:rFonts w:hint="eastAsia"/>
-          <w:color w:val="000000"/>
-          <w:lang w:eastAsia="zh-CN"/>
-        </w:rPr>
-        <w:t/>
-      </w:r>
-      <w:proofErr w:type="spellEnd"/>
-      <w:r>
-        <w:rPr>
-          <w:rFonts w:hint="eastAsia"/>
-          <w:color w:val="000000"/>
-          <w:lang w:eastAsia="zh-CN"/>
-        </w:rPr>
-        <w:t/>
-      </w:r>
-      <w:proofErr w:type="spellStart"/>
-      <w:r>
-        <w:rPr>
-          <w:color w:val="000000"/>
-        </w:rPr>
-        <w:t/>
-      </w:r>
-      <w:r>
-        <w:rPr>
-          <w:color w:val="000000"/>
-        </w:rPr>
-        <w:t/>
-      </w:r>
-      <w:r>
-        <w:rPr>
-          <w:color w:val="000000"/>
-        </w:rPr>
-        <w:t/>
-      </w:r>
-      <w:r>
-        <w:rPr>
-          <w:color w:val="000000"/>
-        </w:rPr>
-        <w:t/>
-      </w:r>
-      <w:r>
-        <w:rPr>
-          <w:color w:val="000000"/>
-        </w:rPr>
-        <w:t/>
-      </w:r>
-      <w:proofErr w:type="spellEnd"/>
-      <w:r>
-        <w:rPr>
-          <w:color w:val="000000"/>
-        </w:rPr>
-        <w:t xml:space="preserve"/>
-      </w:r>
-      <w:proofErr w:type="spellStart"/>
-      <w:r>
-        <w:rPr>
-          <w:color w:val="000000"/>
-        </w:rPr>
-        <w:t/>
-      </w:r>
-      <w:r>
-        <w:rPr>
-          <w:color w:val="000000"/>
-        </w:rPr>
-        <w:t/>
-      </w:r>
-      <w:r>
-        <w:rPr>
-          <w:color w:val="000000"/>
-        </w:rPr>
-        <w:t/>
-      </w:r>
-      <w:proofErr w:type="spellEnd"/>
-      <w:r>
-        <w:rPr>
-          <w:color w:val="000000"/>
-        </w:rPr>
-        <w:t/>
-      </w:r>
-      <w:proofErr w:type="spellStart"/>
-      <w:r>
-        <w:rPr>
-          <w:color w:val="000000"/>
-        </w:rPr>
-        <w:t/>
-      </w:r>
-      <w:proofErr w:type="spellEnd"/>
-      <w:r>
-        <w:rPr>
-          <w:rFonts w:hint="eastAsia"/>
-          <w:color w:val="000000"/>
-          <w:lang w:eastAsia="zh-CN"/>
-        </w:rPr>
-        <w:t/>
-      </w:r>
-      <w:r>
-        <w:rPr>
-          <w:rFonts w:hint="eastAsia"/>
-          <w:color w:val="000000"/>
-          <w:lang w:eastAsia="zh-CN"/>
-        </w:rPr>
-        <w:t/>
+      <w:r>
+        <w:rPr>
+          <w:color w:val="121212"/>
+        </w:rPr>
+        <w:t>[</w:t>
+      </w:r>
+      <w:r>
+        <w:rPr>
+          <w:color w:val="121212"/>
+        </w:rPr>
+        <w:t>软件、工具、语言；仅保留有证据的内容</w:t>
+      </w:r>
+      <w:r>
+        <w:rPr>
+          <w:color w:val="121212"/>
+        </w:rPr>
+        <w:t>]</w:t>
       </w:r>
     </w:p>
     <w:p>
@@ -1071,151 +1053,46 @@
       <w:r>
         <w:rPr>
           <w:b/>
-          <w:color w:val="000000"/>
-          <w:lang w:eastAsia="zh-CN"/>
-        </w:rPr>
-        <w:t>专业能力</w:t>
+          <w:color w:val="121212"/>
+        </w:rPr>
+        <w:t>工程能力</w:t>
       </w:r>
       <w:r>
         <w:rPr>
           <w:b/>
-          <w:color w:val="000000"/>
-          <w:lang w:eastAsia="zh-CN"/>
+          <w:color w:val="121212"/>
         </w:rPr>
         <w:t xml:space="preserve">  </w:t>
       </w:r>
       <w:r>
         <w:rPr>
-          <w:color w:val="000000"/>
-          <w:lang w:eastAsia="zh-CN"/>
-        </w:rPr>
-        <w:t>[方法、理论、标准与验证能力；按JD筛选]</w:t>
-      </w:r>
-      <w:r>
-        <w:rPr>
-          <w:color w:val="000000"/>
-          <w:lang w:eastAsia="zh-CN"/>
-        </w:rPr>
-        <w:t/>
-      </w:r>
-      <w:r>
-        <w:rPr>
-          <w:color w:val="000000"/>
-          <w:lang w:eastAsia="zh-CN"/>
-        </w:rPr>
-        <w:t/>
-      </w:r>
-      <w:r>
-        <w:rPr>
-          <w:color w:val="000000"/>
-          <w:lang w:eastAsia="zh-CN"/>
-        </w:rPr>
-        <w:t/>
-      </w:r>
-      <w:r>
-        <w:rPr>
-          <w:color w:val="000000"/>
-        </w:rPr>
-        <w:t/>
-      </w:r>
-      <w:r>
-        <w:rPr>
-          <w:color w:val="000000"/>
-          <w:lang w:eastAsia="zh-CN"/>
-        </w:rPr>
-        <w:t/>
-      </w:r>
-      <w:r>
-        <w:rPr>
-          <w:color w:val="000000"/>
-          <w:lang w:eastAsia="zh-CN"/>
-        </w:rPr>
-        <w:t/>
-      </w:r>
-      <w:r>
-        <w:rPr>
-          <w:color w:val="000000"/>
-        </w:rPr>
-        <w:t/>
-      </w:r>
-      <w:r>
-        <w:rPr>
-          <w:color w:val="000000"/>
-          <w:lang w:eastAsia="zh-CN"/>
-        </w:rPr>
-        <w:t xml:space="preserve"/>
-      </w:r>
-      <w:r>
-        <w:rPr>
-          <w:rFonts w:hint="eastAsia"/>
-          <w:color w:val="000000"/>
-          <w:lang w:eastAsia="zh-CN"/>
-        </w:rPr>
-        <w:t/>
-      </w:r>
-      <w:r>
-        <w:rPr>
-          <w:color w:val="000000"/>
-          <w:lang w:eastAsia="zh-CN"/>
-        </w:rPr>
-        <w:t/>
-      </w:r>
-      <w:r>
-        <w:rPr>
-          <w:rFonts w:hint="eastAsia"/>
-          <w:color w:val="000000"/>
-          <w:lang w:eastAsia="zh-CN"/>
-        </w:rPr>
-        <w:t/>
-      </w:r>
-      <w:r>
-        <w:rPr>
-          <w:color w:val="000000"/>
-          <w:lang w:eastAsia="zh-CN"/>
-        </w:rPr>
-        <w:t/>
-      </w:r>
-      <w:r>
-        <w:rPr>
-          <w:color w:val="000000"/>
-          <w:lang w:eastAsia="zh-CN"/>
-        </w:rPr>
-        <w:t/>
-      </w:r>
-      <w:r>
-        <w:rPr>
-          <w:color w:val="000000"/>
-          <w:lang w:eastAsia="zh-CN"/>
-        </w:rPr>
-        <w:t/>
-      </w:r>
-      <w:r>
-        <w:rPr>
-          <w:color w:val="000000"/>
-          <w:lang w:eastAsia="zh-CN"/>
-        </w:rPr>
-        <w:t/>
-      </w:r>
-      <w:r>
-        <w:rPr>
-          <w:color w:val="000000"/>
-          <w:lang w:eastAsia="zh-CN"/>
-        </w:rPr>
-        <w:t/>
-      </w:r>
-      <w:r>
-        <w:rPr>
-          <w:color w:val="000000"/>
-          <w:lang w:eastAsia="zh-CN"/>
-        </w:rPr>
-        <w:t/>
-      </w:r>
-      <w:r>
-        <w:rPr>
-          <w:color w:val="000000"/>
-          <w:lang w:eastAsia="zh-CN"/>
-        </w:rPr>
-        <w:t/>
+          <w:color w:val="121212"/>
+        </w:rPr>
+        <w:t>[</w:t>
+      </w:r>
+      <w:r>
+        <w:rPr>
+          <w:color w:val="121212"/>
+        </w:rPr>
+        <w:t>方法、理论、验证与协作能力；按</w:t>
+      </w:r>
+      <w:r>
+        <w:rPr>
+          <w:color w:val="121212"/>
+        </w:rPr>
+        <w:t>JD</w:t>
+      </w:r>
+      <w:r>
+        <w:rPr>
+          <w:color w:val="121212"/>
+        </w:rPr>
+        <w:t>筛选</w:t>
+      </w:r>
+      <w:r>
+        <w:rPr>
+          <w:color w:val="121212"/>
+        </w:rPr>
+        <w:t>]</w:t>
       </w:r>
     </w:p>
     <w:p>
@@ -1231,7 +1108,6 @@
           <w:b/>
           <w:color w:val="1C4970"/>
           <w:sz w:val="22"/>
-          <w:lang w:eastAsia="zh-CN"/>
         </w:rPr>
         <w:t>▌</w:t>
       </w:r>
@@ -1240,7 +1116,6 @@
           <w:b/>
           <w:color w:val="121212"/>
           <w:sz w:val="23"/>
-          <w:lang w:eastAsia="zh-CN"/>
         </w:rPr>
         <w:t>实习经历</w:t>
       </w:r>
@@ -1251,43 +1126,96 @@
         <w:tabs>
           <w:tab w:val="right" w:pos="10220"/>
         </w:tabs>
-        <w:spacing w:before="14" w:after="2"/>
+        <w:spacing w:before="12" w:after="2"/>
         <w:rPr>
           <w:lang w:eastAsia="zh-CN"/>
         </w:rPr>
       </w:pPr>
+      <w:bookmarkStart w:id="0" w:name="OLE_LINK1"/>
       <w:r>
         <w:rPr>
           <w:b/>
           <w:color w:val="121212"/>
-          <w:lang w:eastAsia="zh-CN"/>
-        </w:rPr>
-        <w:t>[公司/组织名称]</w:t>
+        </w:rPr>
+        <w:t>[</w:t>
       </w:r>
       <w:r>
         <w:rPr>
           <w:b/>
           <w:color w:val="121212"/>
-          <w:lang w:eastAsia="zh-CN"/>
-        </w:rPr>
-        <w:t xml:space="preserve">  </w:t>
+        </w:rPr>
+        <w:t>公司</w:t>
       </w:r>
       <w:r>
         <w:rPr>
           <w:b/>
           <w:color w:val="121212"/>
-          <w:lang w:eastAsia="zh-CN"/>
-        </w:rPr>
-        <w:t>[岗位/角色]</w:t>
+        </w:rPr>
+        <w:t>/</w:t>
       </w:r>
       <w:r>
         <w:rPr>
           <w:b/>
           <w:color w:val="121212"/>
-          <w:lang w:eastAsia="zh-CN"/>
+        </w:rPr>
+        <w:t>组织名称</w:t>
+      </w:r>
+      <w:r>
+        <w:rPr>
+          <w:b/>
+          <w:color w:val="121212"/>
+        </w:rPr>
+        <w:t>]  [</w:t>
+      </w:r>
+      <w:r>
+        <w:rPr>
+          <w:b/>
+          <w:color w:val="121212"/>
+        </w:rPr>
+        <w:t>岗位</w:t>
+      </w:r>
+      <w:r>
+        <w:rPr>
+          <w:b/>
+          <w:color w:val="121212"/>
+        </w:rPr>
+        <w:t>/</w:t>
+      </w:r>
+      <w:r>
+        <w:rPr>
+          <w:b/>
+          <w:color w:val="121212"/>
+        </w:rPr>
+        <w:t>角色</w:t>
+      </w:r>
+      <w:r>
+        <w:rPr>
+          <w:b/>
+          <w:color w:val="121212"/>
+        </w:rPr>
+        <w:t>]</w:t>
+      </w:r>
+      <w:r>
+        <w:rPr>
+          <w:b/>
+          <w:color w:val="121212"/>
         </w:rPr>
         <w:tab/>
-        <w:t>[起止时间]</w:t>
+        <w:t>[</w:t>
+      </w:r>
+      <w:r>
+        <w:rPr>
+          <w:b/>
+          <w:color w:val="121212"/>
+        </w:rPr>
+        <w:t>起止时间</w:t>
+      </w:r>
+      <w:r>
+        <w:rPr>
+          <w:b/>
+          <w:color w:val="121212"/>
+        </w:rPr>
+        <w:t>]</w:t>
       </w:r>
     </w:p>
     <w:p>
@@ -1302,160 +1230,96 @@
       <w:r>
         <w:rPr>
           <w:color w:val="343434"/>
+        </w:rPr>
+        <w:t>[</w:t>
+      </w:r>
+      <w:r>
+        <w:rPr>
+          <w:color w:val="343434"/>
+        </w:rPr>
+        <w:t>经历要点</w:t>
+      </w:r>
+      <w:r>
+        <w:rPr>
+          <w:color w:val="343434"/>
+        </w:rPr>
+        <w:t>1</w:t>
+      </w:r>
+      <w:r>
+        <w:rPr>
+          <w:color w:val="343434"/>
+        </w:rPr>
+        <w:t>：问题或目标</w:t>
+      </w:r>
+      <w:r>
+        <w:rPr>
+          <w:color w:val="343434"/>
+        </w:rPr>
+        <w:t>—</w:t>
+      </w:r>
+      <w:r>
+        <w:rPr>
+          <w:color w:val="343434"/>
+        </w:rPr>
+        <w:t>个人行动</w:t>
+      </w:r>
+      <w:r>
+        <w:rPr>
+          <w:color w:val="343434"/>
+        </w:rPr>
+        <w:t>—</w:t>
+      </w:r>
+      <w:r>
+        <w:rPr>
+          <w:color w:val="343434"/>
+        </w:rPr>
+        <w:t>结果或验证。</w:t>
+      </w:r>
+      <w:r>
+        <w:rPr>
+          <w:color w:val="343434"/>
+        </w:rPr>
+        <w:t>]</w:t>
+      </w:r>
+    </w:p>
+    <w:p>
+      <w:pPr>
+        <w:pStyle w:val="a0"/>
+        <w:spacing w:after="1"/>
+        <w:ind w:left="227" w:hanging="133"/>
+        <w:rPr>
           <w:lang w:eastAsia="zh-CN"/>
         </w:rPr>
-        <w:t>[经历要点1：问题或目标—个人行动—量化结果或验证。]</w:t>
-      </w:r>
-      <w:r>
-        <w:rPr>
-          <w:b/>
-          <w:color w:val="121212"/>
-          <w:lang w:eastAsia="zh-CN"/>
-        </w:rPr>
-        <w:t/>
-      </w:r>
-      <w:r>
-        <w:rPr>
-          <w:b/>
-          <w:color w:val="121212"/>
-          <w:lang w:eastAsia="zh-CN"/>
-        </w:rPr>
-        <w:t/>
-      </w:r>
+      </w:pPr>
       <w:r>
         <w:rPr>
           <w:color w:val="343434"/>
-          <w:lang w:eastAsia="zh-CN"/>
-        </w:rPr>
-        <w:t/>
-      </w:r>
-      <w:r>
-        <w:rPr>
-          <w:b/>
-          <w:color w:val="121212"/>
-          <w:lang w:eastAsia="zh-CN"/>
-        </w:rPr>
-        <w:t/>
-      </w:r>
-      <w:r>
-        <w:rPr>
-          <w:b/>
-          <w:color w:val="121212"/>
-          <w:lang w:eastAsia="zh-CN"/>
-        </w:rPr>
-        <w:t/>
+        </w:rPr>
+        <w:t>[</w:t>
       </w:r>
       <w:r>
         <w:rPr>
           <w:color w:val="343434"/>
-          <w:lang w:eastAsia="zh-CN"/>
-        </w:rPr>
-        <w:t/>
+        </w:rPr>
+        <w:t>经历要点</w:t>
       </w:r>
       <w:r>
         <w:rPr>
           <w:color w:val="343434"/>
-          <w:lang w:eastAsia="zh-CN"/>
-        </w:rPr>
-        <w:t/>
+        </w:rPr>
+        <w:t>2</w:t>
       </w:r>
       <w:r>
         <w:rPr>
           <w:color w:val="343434"/>
-          <w:lang w:eastAsia="zh-CN"/>
-        </w:rPr>
-        <w:t/>
-      </w:r>
-      <w:r>
-        <w:rPr>
-          <w:rFonts w:hint="eastAsia"/>
+        </w:rPr>
+        <w:t>：说明本人贡献、工具方法和业务影响。</w:t>
+      </w:r>
+      <w:r>
+        <w:rPr>
           <w:color w:val="343434"/>
-          <w:lang w:eastAsia="zh-CN"/>
-        </w:rPr>
-        <w:t/>
-      </w:r>
-      <w:r>
-        <w:rPr>
-          <w:color w:val="343434"/>
-          <w:lang w:eastAsia="zh-CN"/>
-        </w:rPr>
-        <w:t/>
-      </w:r>
-      <w:r>
-        <w:rPr>
-          <w:b/>
-          <w:color w:val="121212"/>
-          <w:lang w:eastAsia="zh-CN"/>
-        </w:rPr>
-        <w:t/>
-      </w:r>
-      <w:r>
-        <w:rPr>
-          <w:color w:val="343434"/>
-          <w:lang w:eastAsia="zh-CN"/>
-        </w:rPr>
-        <w:t/>
-      </w:r>
-      <w:r>
-        <w:rPr>
-          <w:b/>
-          <w:color w:val="121212"/>
-          <w:lang w:eastAsia="zh-CN"/>
-        </w:rPr>
-        <w:t/>
-      </w:r>
-      <w:r>
-        <w:rPr>
-          <w:color w:val="343434"/>
-          <w:lang w:eastAsia="zh-CN"/>
-        </w:rPr>
-        <w:t/>
-      </w:r>
-      <w:r>
-        <w:rPr>
-          <w:b/>
-          <w:color w:val="121212"/>
-          <w:lang w:eastAsia="zh-CN"/>
-        </w:rPr>
-        <w:t/>
-      </w:r>
-      <w:r>
-        <w:rPr>
-          <w:b/>
-          <w:color w:val="121212"/>
-          <w:lang w:eastAsia="zh-CN"/>
-        </w:rPr>
-        <w:t/>
-      </w:r>
-      <w:r>
-        <w:rPr>
-          <w:b/>
-          <w:color w:val="121212"/>
-          <w:lang w:eastAsia="zh-CN"/>
-        </w:rPr>
-        <w:t/>
-      </w:r>
-      <w:r>
-        <w:rPr>
-          <w:color w:val="343434"/>
-          <w:lang w:eastAsia="zh-CN"/>
-        </w:rPr>
-        <w:t/>
-      </w:r>
-      <w:r>
-        <w:rPr>
-          <w:bCs/>
-          <w:color w:val="121212"/>
-          <w:lang w:eastAsia="zh-CN"/>
-        </w:rPr>
-        <w:t/>
-      </w:r>
-      <w:r>
-        <w:rPr>
-          <w:color w:val="343434"/>
-          <w:lang w:eastAsia="zh-CN"/>
-        </w:rPr>
-        <w:t/>
+        </w:rPr>
+        <w:t>]</w:t>
       </w:r>
     </w:p>
     <w:p>
@@ -1470,104 +1334,74 @@
       </w:pPr>
       <w:r>
         <w:rPr>
-          <w:rFonts w:hint="eastAsia"/>
-          <w:color w:val="000000"/>
+          <w:color w:val="343434"/>
+        </w:rPr>
+        <w:t>[</w:t>
+      </w:r>
+      <w:r>
+        <w:rPr>
+          <w:color w:val="343434"/>
+        </w:rPr>
+        <w:t>经历要点</w:t>
+      </w:r>
+      <w:r>
+        <w:rPr>
+          <w:color w:val="343434"/>
+        </w:rPr>
+        <w:t>3</w:t>
+      </w:r>
+      <w:r>
+        <w:rPr>
+          <w:color w:val="343434"/>
+        </w:rPr>
+        <w:t>：保留参与范围、条件与必要限定词。</w:t>
+      </w:r>
+      <w:r>
+        <w:rPr>
+          <w:color w:val="343434"/>
+        </w:rPr>
+        <w:t>]</w:t>
+      </w:r>
+    </w:p>
+    <w:bookmarkEnd w:id="0"/>
+    <w:p>
+      <w:pPr>
+        <w:pStyle w:val="a0"/>
+        <w:spacing w:after="1"/>
+        <w:ind w:left="227" w:hanging="133"/>
+        <w:rPr>
           <w:lang w:eastAsia="zh-CN"/>
         </w:rPr>
-        <w:t>[经历要点2：说明本人贡献、工具方法和业务影响。]</w:t>
-      </w:r>
-      <w:r>
-        <w:rPr>
-          <w:color w:val="000000"/>
-          <w:lang w:eastAsia="zh-CN"/>
-        </w:rPr>
-        <w:t/>
-      </w:r>
-      <w:r>
-        <w:rPr>
-          <w:b/>
-          <w:color w:val="000000"/>
-          <w:lang w:eastAsia="zh-CN"/>
-        </w:rPr>
-        <w:t/>
-      </w:r>
-      <w:r>
-        <w:rPr>
-          <w:rFonts w:hint="eastAsia"/>
-          <w:bCs/>
-          <w:color w:val="000000"/>
-          <w:lang w:eastAsia="zh-CN"/>
-        </w:rPr>
-        <w:t/>
-      </w:r>
-      <w:r>
-        <w:rPr>
-          <w:rFonts w:hint="eastAsia"/>
-          <w:color w:val="000000"/>
-          <w:lang w:eastAsia="zh-CN"/>
-        </w:rPr>
-        <w:t/>
-      </w:r>
-      <w:r>
-        <w:rPr>
-          <w:color w:val="000000"/>
-          <w:lang w:eastAsia="zh-CN"/>
-        </w:rPr>
-        <w:t/>
-      </w:r>
-      <w:proofErr w:type="gramStart"/>
-      <w:r>
-        <w:rPr>
-          <w:rFonts w:hint="eastAsia"/>
-          <w:color w:val="000000"/>
-          <w:lang w:eastAsia="zh-CN"/>
-        </w:rPr>
-        <w:t/>
-      </w:r>
-      <w:r>
-        <w:rPr>
-          <w:color w:val="000000"/>
-          <w:lang w:eastAsia="zh-CN"/>
-        </w:rPr>
-        <w:t/>
-      </w:r>
-      <w:proofErr w:type="gramEnd"/>
-      <w:r>
-        <w:rPr>
-          <w:color w:val="000000"/>
-          <w:lang w:eastAsia="zh-CN"/>
-        </w:rPr>
-        <w:t/>
-      </w:r>
-      <w:r>
-        <w:rPr>
-          <w:rFonts w:hint="eastAsia"/>
-          <w:color w:val="000000"/>
-          <w:lang w:eastAsia="zh-CN"/>
-        </w:rPr>
-        <w:t/>
-      </w:r>
-      <w:r>
-        <w:rPr>
-          <w:color w:val="000000"/>
-          <w:lang w:eastAsia="zh-CN"/>
-        </w:rPr>
-        <w:t/>
-      </w:r>
-      <w:r>
-        <w:rPr>
-          <w:b/>
-          <w:color w:val="000000"/>
-          <w:lang w:eastAsia="zh-CN"/>
-        </w:rPr>
-        <w:t/>
-      </w:r>
-      <w:r>
-        <w:rPr>
-          <w:color w:val="000000"/>
-          <w:lang w:eastAsia="zh-CN"/>
-        </w:rPr>
-        <w:t/>
+      </w:pPr>
+      <w:r>
+        <w:rPr>
+          <w:color w:val="343434"/>
+        </w:rPr>
+        <w:t>[</w:t>
+      </w:r>
+      <w:r>
+        <w:rPr>
+          <w:color w:val="343434"/>
+        </w:rPr>
+        <w:t>经历要点</w:t>
+      </w:r>
+      <w:r>
+        <w:rPr>
+          <w:color w:val="343434"/>
+        </w:rPr>
+        <w:t>4</w:t>
+      </w:r>
+      <w:r>
+        <w:rPr>
+          <w:color w:val="343434"/>
+        </w:rPr>
+        <w:t>：量化结果须包含比较基准或验证方式。</w:t>
+      </w:r>
+      <w:r>
+        <w:rPr>
+          <w:color w:val="343434"/>
+        </w:rPr>
+        <w:t>]</w:t>
       </w:r>
     </w:p>
     <w:p>
@@ -1583,7 +1417,6 @@
           <w:b/>
           <w:color w:val="1C4970"/>
           <w:sz w:val="22"/>
-          <w:lang w:eastAsia="zh-CN"/>
         </w:rPr>
         <w:t>▌</w:t>
       </w:r>
@@ -1592,9 +1425,8 @@
           <w:b/>
           <w:color w:val="121212"/>
           <w:sz w:val="23"/>
-          <w:lang w:eastAsia="zh-CN"/>
-        </w:rPr>
-        <w:t>项目经历</w:t>
+        </w:rPr>
+        <w:t>项目与科研经历</w:t>
       </w:r>
     </w:p>
     <w:p>
@@ -1612,65 +1444,79 @@
         <w:rPr>
           <w:b/>
           <w:color w:val="121212"/>
-          <w:lang w:eastAsia="zh-CN"/>
-        </w:rPr>
-        <w:t>[项目名称1]</w:t>
+        </w:rPr>
+        <w:t>[</w:t>
       </w:r>
       <w:r>
         <w:rPr>
           <w:b/>
           <w:color w:val="121212"/>
-          <w:lang w:eastAsia="zh-CN"/>
-        </w:rPr>
-        <w:t/>
+        </w:rPr>
+        <w:t>项目名称</w:t>
       </w:r>
       <w:r>
         <w:rPr>
           <w:b/>
           <w:color w:val="121212"/>
-          <w:lang w:eastAsia="zh-CN"/>
-        </w:rPr>
-        <w:t/>
+        </w:rPr>
+        <w:t>1]  [</w:t>
       </w:r>
       <w:r>
         <w:rPr>
           <w:b/>
           <w:color w:val="121212"/>
-          <w:lang w:eastAsia="zh-CN"/>
-        </w:rPr>
-        <w:t xml:space="preserve">  </w:t>
+        </w:rPr>
+        <w:t>合作方</w:t>
       </w:r>
       <w:r>
         <w:rPr>
           <w:b/>
           <w:color w:val="121212"/>
-          <w:lang w:eastAsia="zh-CN"/>
-        </w:rPr>
-        <w:t>[合作方/场景]</w:t>
+        </w:rPr>
+        <w:t>/</w:t>
       </w:r>
       <w:r>
         <w:rPr>
           <w:b/>
           <w:color w:val="121212"/>
-          <w:lang w:eastAsia="zh-CN"/>
-        </w:rPr>
-        <w:tab/>
-        <w:t xml:space="preserve">[起止时间]</w:t>
+        </w:rPr>
+        <w:t>场景</w:t>
       </w:r>
       <w:r>
         <w:rPr>
           <w:b/>
           <w:color w:val="121212"/>
-          <w:lang w:eastAsia="zh-CN"/>
-        </w:rPr>
-        <w:t/>
+        </w:rPr>
+        <w:t>]</w:t>
+      </w:r>
+      <w:r>
+        <w:rPr>
+          <w:b/>
+          <w:color w:val="121212"/>
+        </w:rPr>
+        <w:tab/>
+        <w:t>[</w:t>
+      </w:r>
+      <w:r>
+        <w:rPr>
+          <w:b/>
+          <w:color w:val="121212"/>
+        </w:rPr>
+        <w:t>起止时间</w:t>
+      </w:r>
+      <w:r>
+        <w:rPr>
+          <w:b/>
+          <w:color w:val="121212"/>
+        </w:rPr>
+        <w:t>]</w:t>
       </w:r>
     </w:p>
     <w:p>
       <w:pPr>
         <w:keepLines/>
         <w:spacing w:after="2"/>
-        <w:ind w:leftChars="17" w:left="34"/>
+        <w:ind w:left="227"/>
         <w:rPr>
           <w:lang w:eastAsia="zh-CN"/>
         </w:rPr>
@@ -1679,7 +1525,6 @@
         <w:rPr>
           <w:b/>
           <w:color w:val="1F4E79"/>
-          <w:lang w:eastAsia="zh-CN"/>
         </w:rPr>
         <w:t>项目简介</w:t>
       </w:r>
@@ -1687,96 +1532,26 @@
         <w:rPr>
           <w:b/>
           <w:color w:val="1F4E79"/>
-          <w:lang w:eastAsia="zh-CN"/>
         </w:rPr>
         <w:t xml:space="preserve">  </w:t>
       </w:r>
       <w:r>
         <w:rPr>
           <w:color w:val="4B4B4B"/>
-          <w:lang w:eastAsia="zh-CN"/>
-        </w:rPr>
-        <w:t>[项目背景、目标和个人职责。]</w:t>
-      </w:r>
-      <w:proofErr w:type="gramStart"/>
+        </w:rPr>
+        <w:t>[</w:t>
+      </w:r>
       <w:r>
         <w:rPr>
           <w:color w:val="4B4B4B"/>
-          <w:lang w:eastAsia="zh-CN"/>
-        </w:rPr>
-        <w:t/>
-      </w:r>
-      <w:proofErr w:type="gramEnd"/>
+        </w:rPr>
+        <w:t>项目背景、目标与本人职责。</w:t>
+      </w:r>
       <w:r>
         <w:rPr>
           <w:color w:val="4B4B4B"/>
-          <w:lang w:eastAsia="zh-CN"/>
-        </w:rPr>
-        <w:t/>
-      </w:r>
-      <w:r>
-        <w:rPr>
-          <w:rFonts w:hint="eastAsia"/>
-          <w:color w:val="4B4B4B"/>
-          <w:lang w:eastAsia="zh-CN"/>
-        </w:rPr>
-        <w:t/>
-      </w:r>
-      <w:r>
-        <w:rPr>
-          <w:color w:val="4B4B4B"/>
-          <w:lang w:eastAsia="zh-CN"/>
-        </w:rPr>
-        <w:t/>
-      </w:r>
-      <w:r>
-        <w:rPr>
-          <w:color w:val="4B4B4B"/>
-          <w:lang w:eastAsia="zh-CN"/>
-        </w:rPr>
-        <w:t/>
-      </w:r>
-      <w:r>
-        <w:rPr>
-          <w:color w:val="4B4B4B"/>
-          <w:lang w:eastAsia="zh-CN"/>
-        </w:rPr>
-        <w:t/>
-      </w:r>
-      <w:r>
-        <w:rPr>
-          <w:color w:val="4B4B4B"/>
-          <w:lang w:eastAsia="zh-CN"/>
-        </w:rPr>
-        <w:t/>
-      </w:r>
-      <w:r>
-        <w:rPr>
-          <w:color w:val="4B4B4B"/>
-          <w:lang w:eastAsia="zh-CN"/>
-        </w:rPr>
-        <w:t/>
-      </w:r>
-      <w:r>
-        <w:rPr>
-          <w:color w:val="4B4B4B"/>
-          <w:lang w:eastAsia="zh-CN"/>
-        </w:rPr>
-        <w:t/>
-      </w:r>
-      <w:r>
-        <w:rPr>
-          <w:color w:val="4B4B4B"/>
-          <w:lang w:eastAsia="zh-CN"/>
-        </w:rPr>
-        <w:t/>
-      </w:r>
-      <w:r>
-        <w:rPr>
-          <w:color w:val="4B4B4B"/>
-          <w:lang w:eastAsia="zh-CN"/>
-        </w:rPr>
-        <w:t/>
+        </w:rPr>
+        <w:t>]</w:t>
       </w:r>
     </w:p>
     <w:p>
@@ -1786,192 +1561,67 @@
         <w:spacing w:before="9"/>
         <w:ind w:left="227"/>
       </w:pPr>
-      <w:proofErr w:type="spellStart"/>
       <w:r>
         <w:rPr>
           <w:b/>
           <w:color w:val="1F4E79"/>
         </w:rPr>
-        <w:t>核心工作</w:t>
-      </w:r>
-      <w:proofErr w:type="spellEnd"/>
+        <w:t>[</w:t>
+      </w:r>
+      <w:r>
+        <w:rPr>
+          <w:b/>
+          <w:color w:val="1F4E79"/>
+        </w:rPr>
+        <w:t>工作模块</w:t>
+      </w:r>
+      <w:r>
+        <w:rPr>
+          <w:b/>
+          <w:color w:val="1F4E79"/>
+        </w:rPr>
+        <w:t>1]</w:t>
+      </w:r>
     </w:p>
     <w:p>
       <w:pPr>
         <w:pStyle w:val="a0"/>
         <w:keepLines/>
         <w:spacing w:after="1"/>
-        <w:ind w:left="300" w:hanging="130"/>
+        <w:ind w:left="454" w:hanging="133"/>
         <w:rPr>
           <w:lang w:eastAsia="zh-CN"/>
         </w:rPr>
       </w:pPr>
       <w:r>
         <w:rPr>
-          <w:color w:val="000000"/>
-          <w:lang w:eastAsia="zh-CN"/>
-        </w:rPr>
-        <w:t>[行动要点1：本人完成的关键工作、方法和判断。]</w:t>
-      </w:r>
-      <w:r>
-        <w:rPr>
-          <w:color w:val="000000"/>
-          <w:lang w:eastAsia="zh-CN"/>
-        </w:rPr>
-        <w:t/>
-      </w:r>
-      <w:r>
-        <w:rPr>
-          <w:color w:val="000000"/>
-          <w:lang w:eastAsia="zh-CN"/>
-        </w:rPr>
-        <w:t/>
-      </w:r>
-      <w:r>
-        <w:rPr>
-          <w:rFonts w:hint="eastAsia"/>
-          <w:color w:val="000000"/>
-          <w:lang w:eastAsia="zh-CN"/>
-        </w:rPr>
-        <w:t/>
-      </w:r>
-      <w:r>
-        <w:rPr>
-          <w:color w:val="000000"/>
-          <w:lang w:eastAsia="zh-CN"/>
-        </w:rPr>
-        <w:t/>
-      </w:r>
-      <w:r>
-        <w:rPr>
-          <w:rFonts w:hint="eastAsia"/>
-          <w:color w:val="000000"/>
-          <w:lang w:eastAsia="zh-CN"/>
-        </w:rPr>
-        <w:t/>
-      </w:r>
-      <w:r>
-        <w:rPr>
-          <w:color w:val="000000"/>
-          <w:lang w:eastAsia="zh-CN"/>
-        </w:rPr>
-        <w:t/>
-      </w:r>
-      <w:r>
-        <w:rPr>
-          <w:color w:val="000000"/>
-          <w:lang w:eastAsia="zh-CN"/>
-        </w:rPr>
-        <w:t/>
-      </w:r>
-      <w:r>
-        <w:rPr>
-          <w:color w:val="000000"/>
-          <w:lang w:eastAsia="zh-CN"/>
-        </w:rPr>
-        <w:t/>
-      </w:r>
-      <w:r>
-        <w:rPr>
-          <w:rFonts w:hint="eastAsia"/>
-          <w:color w:val="000000"/>
-          <w:lang w:eastAsia="zh-CN"/>
-        </w:rPr>
-        <w:t/>
-      </w:r>
-      <w:r>
-        <w:rPr>
-          <w:color w:val="000000"/>
-          <w:lang w:eastAsia="zh-CN"/>
-        </w:rPr>
-        <w:t/>
-      </w:r>
-      <w:r>
-        <w:rPr>
-          <w:bCs/>
-          <w:color w:val="000000"/>
-          <w:lang w:eastAsia="zh-CN"/>
-        </w:rPr>
-        <w:t/>
-      </w:r>
-      <w:r>
-        <w:rPr>
-          <w:bCs/>
-          <w:color w:val="000000"/>
-          <w:lang w:eastAsia="zh-CN"/>
-        </w:rPr>
-        <w:t/>
-      </w:r>
-      <w:r>
-        <w:rPr>
-          <w:bCs/>
-          <w:color w:val="000000"/>
-          <w:lang w:eastAsia="zh-CN"/>
-        </w:rPr>
-        <w:t/>
-      </w:r>
-      <w:r>
-        <w:rPr>
-          <w:bCs/>
-          <w:color w:val="000000"/>
-          <w:lang w:eastAsia="zh-CN"/>
-        </w:rPr>
-        <w:t/>
-      </w:r>
-      <w:r>
-        <w:rPr>
-          <w:bCs/>
-          <w:color w:val="000000"/>
-          <w:lang w:eastAsia="zh-CN"/>
-        </w:rPr>
-        <w:t/>
-      </w:r>
-      <w:r>
-        <w:rPr>
-          <w:bCs/>
-          <w:color w:val="000000"/>
-          <w:lang w:eastAsia="zh-CN"/>
-        </w:rPr>
-        <w:t/>
-      </w:r>
-      <w:r>
-        <w:rPr>
-          <w:bCs/>
-          <w:color w:val="000000"/>
-          <w:lang w:eastAsia="zh-CN"/>
-        </w:rPr>
-        <w:t/>
-      </w:r>
-      <w:r>
-        <w:rPr>
-          <w:rFonts w:hint="eastAsia"/>
-          <w:bCs/>
-          <w:color w:val="000000"/>
-          <w:lang w:eastAsia="zh-CN"/>
-        </w:rPr>
-        <w:t/>
-      </w:r>
-      <w:r>
-        <w:rPr>
-          <w:color w:val="000000"/>
-          <w:lang w:eastAsia="zh-CN"/>
-        </w:rPr>
-        <w:t/>
-      </w:r>
-      <w:r>
-        <w:rPr>
-          <w:rFonts w:hint="eastAsia"/>
-          <w:color w:val="000000"/>
-          <w:lang w:eastAsia="zh-CN"/>
-        </w:rPr>
-        <w:t/>
-      </w:r>
-      <w:r>
-        <w:rPr>
-          <w:color w:val="000000"/>
-          <w:lang w:eastAsia="zh-CN"/>
-        </w:rPr>
-        <w:t/>
+          <w:color w:val="343434"/>
+        </w:rPr>
+        <w:t>[</w:t>
+      </w:r>
+      <w:r>
+        <w:rPr>
+          <w:color w:val="343434"/>
+        </w:rPr>
+        <w:t>行动要点</w:t>
+      </w:r>
+      <w:r>
+        <w:rPr>
+          <w:color w:val="343434"/>
+        </w:rPr>
+        <w:t>1</w:t>
+      </w:r>
+      <w:r>
+        <w:rPr>
+          <w:color w:val="343434"/>
+        </w:rPr>
+        <w:t>：本人完成的关键工作、方法和判断。</w:t>
+      </w:r>
+      <w:r>
+        <w:rPr>
+          <w:color w:val="343434"/>
+        </w:rPr>
+        <w:t>]</w:t>
       </w:r>
     </w:p>
     <w:p>
@@ -1979,149 +1629,40 @@
         <w:pStyle w:val="a0"/>
         <w:keepLines/>
         <w:spacing w:after="1"/>
-        <w:ind w:left="300" w:hanging="130"/>
+        <w:ind w:left="454" w:hanging="133"/>
         <w:rPr>
           <w:lang w:eastAsia="zh-CN"/>
         </w:rPr>
       </w:pPr>
       <w:r>
         <w:rPr>
-          <w:color w:val="000000"/>
-          <w:lang w:eastAsia="zh-CN"/>
-        </w:rPr>
-        <w:t>[成果要点1：量化结果、比较基准和验证方式。]</w:t>
-      </w:r>
-      <w:r>
-        <w:rPr>
-          <w:b/>
-          <w:color w:val="000000"/>
-          <w:lang w:eastAsia="zh-CN"/>
-        </w:rPr>
-        <w:t/>
-      </w:r>
-      <w:r>
-        <w:rPr>
-          <w:rFonts w:hint="eastAsia"/>
-          <w:b/>
-          <w:color w:val="000000"/>
-          <w:lang w:eastAsia="zh-CN"/>
-        </w:rPr>
-        <w:t/>
-      </w:r>
-      <w:r>
-        <w:rPr>
-          <w:b/>
-          <w:color w:val="000000"/>
-          <w:lang w:eastAsia="zh-CN"/>
-        </w:rPr>
-        <w:t/>
-      </w:r>
-      <w:r>
-        <w:rPr>
-          <w:b/>
-          <w:color w:val="000000"/>
-          <w:lang w:eastAsia="zh-CN"/>
-        </w:rPr>
-        <w:t/>
-      </w:r>
-      <w:r>
-        <w:rPr>
-          <w:b/>
-          <w:color w:val="000000"/>
-          <w:lang w:eastAsia="zh-CN"/>
-        </w:rPr>
-        <w:t/>
-      </w:r>
-      <w:r>
-        <w:rPr>
-          <w:color w:val="000000"/>
-          <w:lang w:eastAsia="zh-CN"/>
-        </w:rPr>
-        <w:t/>
-      </w:r>
-      <w:proofErr w:type="gramStart"/>
-      <w:r>
-        <w:rPr>
-          <w:color w:val="000000"/>
-          <w:lang w:eastAsia="zh-CN"/>
-        </w:rPr>
-        <w:t/>
-      </w:r>
-      <w:proofErr w:type="gramEnd"/>
-      <w:r>
-        <w:rPr>
-          <w:color w:val="000000"/>
-          <w:lang w:eastAsia="zh-CN"/>
-        </w:rPr>
-        <w:t/>
-      </w:r>
-      <w:r>
-        <w:rPr>
-          <w:b/>
-          <w:color w:val="000000"/>
-          <w:lang w:eastAsia="zh-CN"/>
-        </w:rPr>
-        <w:t/>
-      </w:r>
-      <w:r>
-        <w:rPr>
-          <w:b/>
-          <w:color w:val="000000"/>
-          <w:lang w:eastAsia="zh-CN"/>
-        </w:rPr>
-        <w:t/>
-      </w:r>
-      <w:r>
-        <w:rPr>
-          <w:color w:val="000000"/>
-          <w:lang w:eastAsia="zh-CN"/>
-        </w:rPr>
-        <w:t/>
-      </w:r>
-      <w:r>
-        <w:rPr>
-          <w:rFonts w:hint="eastAsia"/>
-          <w:color w:val="000000"/>
-          <w:lang w:eastAsia="zh-CN"/>
-        </w:rPr>
-        <w:t/>
-      </w:r>
-      <w:r>
-        <w:rPr>
-          <w:color w:val="000000"/>
-          <w:lang w:eastAsia="zh-CN"/>
-        </w:rPr>
-        <w:t/>
-      </w:r>
-      <w:r>
-        <w:rPr>
-          <w:rFonts w:hint="eastAsia"/>
-          <w:color w:val="000000"/>
-          <w:lang w:eastAsia="zh-CN"/>
-        </w:rPr>
-        <w:t/>
-      </w:r>
-      <w:r>
-        <w:rPr>
-          <w:color w:val="000000"/>
-          <w:lang w:eastAsia="zh-CN"/>
-        </w:rPr>
-        <w:t/>
-      </w:r>
-      <w:r>
-        <w:rPr>
-          <w:b/>
-          <w:color w:val="000000"/>
-          <w:lang w:eastAsia="zh-CN"/>
-        </w:rPr>
-        <w:t/>
-      </w:r>
-      <w:r>
-        <w:rPr>
-          <w:color w:val="000000"/>
-          <w:lang w:eastAsia="zh-CN"/>
-        </w:rPr>
-        <w:t/>
+          <w:color w:val="343434"/>
+        </w:rPr>
+        <w:t>[</w:t>
+      </w:r>
+      <w:r>
+        <w:rPr>
+          <w:color w:val="343434"/>
+        </w:rPr>
+        <w:t>结果要点</w:t>
+      </w:r>
+      <w:r>
+        <w:rPr>
+          <w:color w:val="343434"/>
+        </w:rPr>
+        <w:t>1</w:t>
+      </w:r>
+      <w:r>
+        <w:rPr>
+          <w:color w:val="343434"/>
+        </w:rPr>
+        <w:t>：量化结果、条件、比较基准和验证方式。</w:t>
+      </w:r>
+      <w:r>
+        <w:rPr>
+          <w:color w:val="343434"/>
+        </w:rPr>
+        <w:t>]</w:t>
       </w:r>
     </w:p>
     <w:p>
@@ -2131,81 +1672,67 @@
         <w:spacing w:before="9"/>
         <w:ind w:left="227"/>
       </w:pPr>
-      <w:proofErr w:type="spellStart"/>
       <w:r>
         <w:rPr>
           <w:b/>
           <w:color w:val="1F4E79"/>
         </w:rPr>
-        <w:t>技术与验证</w:t>
-      </w:r>
-      <w:proofErr w:type="spellEnd"/>
+        <w:t>[</w:t>
+      </w:r>
+      <w:r>
+        <w:rPr>
+          <w:b/>
+          <w:color w:val="1F4E79"/>
+        </w:rPr>
+        <w:t>工作模块</w:t>
+      </w:r>
+      <w:r>
+        <w:rPr>
+          <w:b/>
+          <w:color w:val="1F4E79"/>
+        </w:rPr>
+        <w:t>2]</w:t>
+      </w:r>
     </w:p>
     <w:p>
       <w:pPr>
         <w:pStyle w:val="a0"/>
         <w:keepLines/>
         <w:spacing w:after="1"/>
-        <w:ind w:left="300" w:hanging="130"/>
+        <w:ind w:left="454" w:hanging="133"/>
         <w:rPr>
           <w:lang w:eastAsia="zh-CN"/>
         </w:rPr>
       </w:pPr>
       <w:r>
         <w:rPr>
-          <w:color w:val="000000"/>
-          <w:lang w:eastAsia="zh-CN"/>
-        </w:rPr>
-        <w:t>[行动要点2：使用的工具、流程或协作方式。]</w:t>
-      </w:r>
-      <w:r>
-        <w:rPr>
-          <w:bCs/>
-          <w:color w:val="000000"/>
-          <w:lang w:eastAsia="zh-CN"/>
-        </w:rPr>
-        <w:t/>
-      </w:r>
-      <w:r>
-        <w:rPr>
-          <w:color w:val="000000"/>
-          <w:lang w:eastAsia="zh-CN"/>
-        </w:rPr>
-        <w:t/>
-      </w:r>
-      <w:r>
-        <w:rPr>
-          <w:b/>
-          <w:bCs/>
-          <w:color w:val="000000"/>
-          <w:lang w:eastAsia="zh-CN"/>
-        </w:rPr>
-        <w:t/>
-      </w:r>
-      <w:r>
-        <w:rPr>
-          <w:b/>
-          <w:bCs/>
-          <w:color w:val="000000"/>
-          <w:lang w:eastAsia="zh-CN"/>
-        </w:rPr>
-        <w:t/>
-      </w:r>
-      <w:r>
-        <w:rPr>
-          <w:b/>
-          <w:bCs/>
-          <w:color w:val="000000"/>
-          <w:lang w:eastAsia="zh-CN"/>
-        </w:rPr>
-        <w:t/>
-      </w:r>
-      <w:r>
-        <w:rPr>
-          <w:color w:val="000000"/>
-          <w:lang w:eastAsia="zh-CN"/>
-        </w:rPr>
-        <w:t/>
+          <w:color w:val="343434"/>
+        </w:rPr>
+        <w:t>[</w:t>
+      </w:r>
+      <w:r>
+        <w:rPr>
+          <w:color w:val="343434"/>
+        </w:rPr>
+        <w:t>行动要点</w:t>
+      </w:r>
+      <w:r>
+        <w:rPr>
+          <w:color w:val="343434"/>
+        </w:rPr>
+        <w:t>2</w:t>
+      </w:r>
+      <w:r>
+        <w:rPr>
+          <w:color w:val="343434"/>
+        </w:rPr>
+        <w:t>：使用的工具、流程或协作方式。</w:t>
+      </w:r>
+      <w:r>
+        <w:rPr>
+          <w:color w:val="343434"/>
+        </w:rPr>
+        <w:t>]</w:t>
       </w:r>
     </w:p>
     <w:p>
@@ -2213,171 +1740,40 @@
         <w:pStyle w:val="a0"/>
         <w:keepLines/>
         <w:spacing w:after="1"/>
-        <w:ind w:left="300" w:hanging="130"/>
+        <w:ind w:left="454" w:hanging="133"/>
         <w:rPr>
           <w:lang w:eastAsia="zh-CN"/>
         </w:rPr>
       </w:pPr>
       <w:r>
         <w:rPr>
-          <w:color w:val="000000"/>
-          <w:lang w:eastAsia="zh-CN"/>
-        </w:rPr>
-        <w:t>[成果要点2：交付物、影响和可追溯证据。]</w:t>
-      </w:r>
-      <w:r>
-        <w:rPr>
-          <w:color w:val="000000"/>
-          <w:lang w:eastAsia="zh-CN"/>
-        </w:rPr>
-        <w:t/>
-      </w:r>
-      <w:r>
-        <w:rPr>
-          <w:color w:val="000000"/>
-          <w:lang w:eastAsia="zh-CN"/>
-        </w:rPr>
-        <w:t/>
-      </w:r>
-      <w:r>
-        <w:rPr>
-          <w:color w:val="000000"/>
-          <w:lang w:eastAsia="zh-CN"/>
-        </w:rPr>
-        <w:t/>
-      </w:r>
-      <w:r>
-        <w:rPr>
-          <w:color w:val="000000"/>
-          <w:lang w:eastAsia="zh-CN"/>
-        </w:rPr>
-        <w:t/>
-      </w:r>
-      <w:r>
-        <w:rPr>
-          <w:color w:val="000000"/>
-          <w:lang w:eastAsia="zh-CN"/>
-        </w:rPr>
-        <w:t/>
-      </w:r>
-      <w:r>
-        <w:rPr>
-          <w:color w:val="000000"/>
-          <w:lang w:eastAsia="zh-CN"/>
-        </w:rPr>
-        <w:t/>
-      </w:r>
-      <w:r>
-        <w:rPr>
-          <w:color w:val="000000"/>
-          <w:lang w:eastAsia="zh-CN"/>
-        </w:rPr>
-        <w:t/>
-      </w:r>
-      <w:r>
-        <w:rPr>
-          <w:bCs/>
-          <w:color w:val="000000"/>
-          <w:lang w:eastAsia="zh-CN"/>
-        </w:rPr>
-        <w:t/>
-      </w:r>
-      <w:r>
-        <w:rPr>
-          <w:color w:val="000000"/>
-          <w:lang w:eastAsia="zh-CN"/>
-        </w:rPr>
-        <w:t/>
-      </w:r>
-      <w:r>
-        <w:rPr>
-          <w:color w:val="000000"/>
-          <w:lang w:eastAsia="zh-CN"/>
-        </w:rPr>
-        <w:t/>
-      </w:r>
-      <w:r>
-        <w:rPr>
-          <w:color w:val="000000"/>
-          <w:lang w:eastAsia="zh-CN"/>
-        </w:rPr>
-        <w:t/>
-      </w:r>
-      <w:r>
-        <w:rPr>
-          <w:color w:val="000000"/>
-          <w:lang w:eastAsia="zh-CN"/>
-        </w:rPr>
-        <w:t/>
-      </w:r>
-      <w:r>
-        <w:rPr>
-          <w:color w:val="000000"/>
-          <w:lang w:eastAsia="zh-CN"/>
-        </w:rPr>
-        <w:t/>
-      </w:r>
-      <w:r>
-        <w:rPr>
-          <w:color w:val="000000"/>
-          <w:lang w:eastAsia="zh-CN"/>
-        </w:rPr>
-        <w:t/>
-      </w:r>
-      <w:r>
-        <w:rPr>
-          <w:bCs/>
-          <w:color w:val="000000"/>
-          <w:lang w:eastAsia="zh-CN"/>
-        </w:rPr>
-        <w:t/>
-      </w:r>
-      <w:proofErr w:type="gramStart"/>
-      <w:r>
-        <w:rPr>
-          <w:bCs/>
-          <w:color w:val="000000"/>
-          <w:lang w:eastAsia="zh-CN"/>
-        </w:rPr>
-        <w:t/>
-      </w:r>
-      <w:r>
-        <w:rPr>
-          <w:color w:val="000000"/>
-          <w:lang w:eastAsia="zh-CN"/>
-        </w:rPr>
-        <w:t/>
-      </w:r>
-      <w:proofErr w:type="gramEnd"/>
-      <w:r>
-        <w:rPr>
-          <w:color w:val="000000"/>
-          <w:lang w:eastAsia="zh-CN"/>
-        </w:rPr>
-        <w:t/>
-      </w:r>
-      <w:r>
-        <w:rPr>
-          <w:bCs/>
-          <w:color w:val="000000"/>
-          <w:lang w:eastAsia="zh-CN"/>
-        </w:rPr>
-        <w:t/>
-      </w:r>
-      <w:r>
-        <w:rPr>
-          <w:bCs/>
-          <w:color w:val="000000"/>
-          <w:lang w:eastAsia="zh-CN"/>
-        </w:rPr>
-        <w:t/>
-      </w:r>
-      <w:r>
-        <w:rPr>
-          <w:color w:val="000000"/>
-          <w:lang w:eastAsia="zh-CN"/>
-        </w:rPr>
-        <w:t/>
+          <w:color w:val="343434"/>
+        </w:rPr>
+        <w:t>[</w:t>
+      </w:r>
+      <w:r>
+        <w:rPr>
+          <w:color w:val="343434"/>
+        </w:rPr>
+        <w:t>结果要点</w:t>
+      </w:r>
+      <w:r>
+        <w:rPr>
+          <w:color w:val="343434"/>
+        </w:rPr>
+        <w:t>2</w:t>
+      </w:r>
+      <w:r>
+        <w:rPr>
+          <w:color w:val="343434"/>
+        </w:rPr>
+        <w:t>：交付物、影响和可追溯证据。</w:t>
+      </w:r>
+      <w:r>
+        <w:rPr>
+          <w:color w:val="343434"/>
+        </w:rPr>
+        <w:t>]</w:t>
       </w:r>
     </w:p>
     <w:p>
@@ -2395,614 +1791,154 @@
         <w:rPr>
           <w:b/>
           <w:color w:val="121212"/>
-          <w:lang w:eastAsia="zh-CN"/>
-        </w:rPr>
-        <w:t>[项目名称2]</w:t>
+        </w:rPr>
+        <w:t>[</w:t>
       </w:r>
       <w:r>
         <w:rPr>
           <w:b/>
           <w:color w:val="121212"/>
-          <w:lang w:eastAsia="zh-CN"/>
-        </w:rPr>
-        <w:t/>
+        </w:rPr>
+        <w:t>项目名称</w:t>
       </w:r>
       <w:r>
         <w:rPr>
           <w:b/>
           <w:color w:val="121212"/>
-          <w:lang w:eastAsia="zh-CN"/>
-        </w:rPr>
-        <w:t/>
-      </w:r>
-      <w:proofErr w:type="gramStart"/>
+        </w:rPr>
+        <w:t>2]  [</w:t>
+      </w:r>
       <w:r>
         <w:rPr>
           <w:b/>
           <w:color w:val="121212"/>
-          <w:lang w:eastAsia="zh-CN"/>
-        </w:rPr>
-        <w:t/>
-      </w:r>
-      <w:proofErr w:type="gramEnd"/>
+        </w:rPr>
+        <w:t>合作方</w:t>
+      </w:r>
       <w:r>
         <w:rPr>
           <w:b/>
           <w:color w:val="121212"/>
-          <w:lang w:eastAsia="zh-CN"/>
-        </w:rPr>
-        <w:t/>
+        </w:rPr>
+        <w:t>/</w:t>
       </w:r>
       <w:r>
         <w:rPr>
           <w:b/>
           <w:color w:val="121212"/>
-          <w:lang w:eastAsia="zh-CN"/>
+        </w:rPr>
+        <w:t>场景</w:t>
+      </w:r>
+      <w:r>
+        <w:rPr>
+          <w:b/>
+          <w:color w:val="121212"/>
+        </w:rPr>
+        <w:t>]</w:t>
+      </w:r>
+      <w:r>
+        <w:rPr>
+          <w:b/>
+          <w:color w:val="121212"/>
         </w:rPr>
         <w:tab/>
-        <w:t>[起止时间]</w:t>
+        <w:t>[</w:t>
+      </w:r>
+      <w:r>
+        <w:rPr>
+          <w:b/>
+          <w:color w:val="121212"/>
+        </w:rPr>
+        <w:t>起止时间</w:t>
+      </w:r>
+      <w:r>
+        <w:rPr>
+          <w:b/>
+          <w:color w:val="121212"/>
+        </w:rPr>
+        <w:t>]</w:t>
       </w:r>
     </w:p>
     <w:p>
       <w:pPr>
         <w:pStyle w:val="a0"/>
         <w:keepLines/>
-        <w:numPr>
-          <w:ilvl w:val="0"/>
-          <w:numId w:val="0"/>
-        </w:numPr>
         <w:spacing w:after="1"/>
-        <w:ind w:left="94"/>
+        <w:ind w:left="227" w:hanging="133"/>
         <w:rPr>
           <w:lang w:eastAsia="zh-CN"/>
         </w:rPr>
       </w:pPr>
       <w:r>
         <w:rPr>
-          <w:b/>
-          <w:color w:val="1F4E79"/>
-          <w:lang w:eastAsia="zh-CN"/>
-        </w:rPr>
-        <w:t>项目简介</w:t>
-      </w:r>
-      <w:r>
-        <w:rPr>
-          <w:b/>
-          <w:color w:val="1F4E79"/>
-          <w:lang w:eastAsia="zh-CN"/>
-        </w:rPr>
-        <w:t xml:space="preserve">  </w:t>
-      </w:r>
-      <w:r>
-        <w:rPr>
-          <w:color w:val="000000"/>
-          <w:lang w:eastAsia="zh-CN"/>
-        </w:rPr>
-        <w:t>[问题、方案与个人行动。]</w:t>
-      </w:r>
-      <w:r>
-        <w:rPr>
-          <w:color w:val="000000"/>
-          <w:lang w:eastAsia="zh-CN"/>
-        </w:rPr>
-        <w:t/>
-      </w:r>
-      <w:r>
-        <w:rPr>
-          <w:color w:val="000000"/>
-          <w:lang w:eastAsia="zh-CN"/>
-        </w:rPr>
-        <w:t/>
-      </w:r>
-      <w:r>
-        <w:rPr>
-          <w:color w:val="000000"/>
-          <w:lang w:eastAsia="zh-CN"/>
-        </w:rPr>
-        <w:t/>
-      </w:r>
-      <w:r>
-        <w:rPr>
-          <w:color w:val="000000"/>
-          <w:lang w:eastAsia="zh-CN"/>
-        </w:rPr>
-        <w:t/>
+          <w:color w:val="343434"/>
+        </w:rPr>
+        <w:t>[</w:t>
+      </w:r>
+      <w:r>
+        <w:rPr>
+          <w:color w:val="343434"/>
+        </w:rPr>
+        <w:t>项目要点</w:t>
+      </w:r>
+      <w:r>
+        <w:rPr>
+          <w:color w:val="343434"/>
+        </w:rPr>
+        <w:t>1</w:t>
+      </w:r>
+      <w:r>
+        <w:rPr>
+          <w:color w:val="343434"/>
+        </w:rPr>
+        <w:t>：问题、方案与个人行动。</w:t>
+      </w:r>
+      <w:r>
+        <w:rPr>
+          <w:color w:val="343434"/>
+        </w:rPr>
+        <w:t>]</w:t>
       </w:r>
     </w:p>
     <w:p>
       <w:pPr>
         <w:pStyle w:val="a0"/>
         <w:keepLines/>
-        <w:numPr>
-          <w:ilvl w:val="0"/>
-          <w:numId w:val="0"/>
-        </w:numPr>
         <w:spacing w:after="1"/>
-        <w:ind w:left="94"/>
+        <w:ind w:left="227" w:hanging="133"/>
         <w:rPr>
           <w:lang w:eastAsia="zh-CN"/>
         </w:rPr>
       </w:pPr>
       <w:r>
         <w:rPr>
-          <w:b/>
-          <w:color w:val="1F4E79"/>
-          <w:lang w:eastAsia="zh-CN"/>
-        </w:rPr>
-        <w:t>验证与结果</w:t>
-      </w:r>
-      <w:r>
-        <w:rPr>
-          <w:b/>
-          <w:color w:val="1F4E79"/>
-          <w:lang w:eastAsia="zh-CN"/>
-        </w:rPr>
-        <w:t xml:space="preserve">  </w:t>
-      </w:r>
-      <w:r>
-        <w:rPr>
-          <w:color w:val="000000"/>
-          <w:lang w:eastAsia="zh-CN"/>
-        </w:rPr>
-        <w:t>[真实指标、条件、比较基准和验证方式。]</w:t>
-      </w:r>
-      <w:r>
-        <w:rPr>
-          <w:bCs/>
-          <w:color w:val="000000"/>
-          <w:lang w:eastAsia="zh-CN"/>
-        </w:rPr>
-        <w:t/>
-      </w:r>
-      <w:r>
-        <w:rPr>
-          <w:bCs/>
-          <w:color w:val="000000"/>
-          <w:lang w:eastAsia="zh-CN"/>
-        </w:rPr>
-        <w:t/>
-      </w:r>
-      <w:r>
-        <w:rPr>
-          <w:bCs/>
-          <w:color w:val="000000"/>
-          <w:lang w:eastAsia="zh-CN"/>
-        </w:rPr>
-        <w:t/>
-      </w:r>
-      <w:r>
-        <w:rPr>
-          <w:bCs/>
-          <w:color w:val="000000"/>
-          <w:lang w:eastAsia="zh-CN"/>
-        </w:rPr>
-        <w:t/>
-      </w:r>
-      <w:r>
-        <w:rPr>
-          <w:color w:val="000000"/>
-          <w:lang w:eastAsia="zh-CN"/>
-        </w:rPr>
-        <w:t/>
-      </w:r>
-      <w:r>
-        <w:rPr>
-          <w:color w:val="000000"/>
-          <w:lang w:eastAsia="zh-CN"/>
-        </w:rPr>
-        <w:t/>
-      </w:r>
-      <w:r>
-        <w:rPr>
-          <w:color w:val="000000"/>
-          <w:lang w:eastAsia="zh-CN"/>
-        </w:rPr>
-        <w:t/>
-      </w:r>
-      <w:r>
-        <w:rPr>
-          <w:b/>
-          <w:color w:val="000000"/>
-          <w:lang w:eastAsia="zh-CN"/>
-        </w:rPr>
-        <w:t/>
-      </w:r>
-      <w:proofErr w:type="spellStart"/>
-      <w:r>
-        <w:rPr>
-          <w:b/>
-          <w:color w:val="000000"/>
-          <w:lang w:eastAsia="zh-CN"/>
-        </w:rPr>
-        <w:t/>
-      </w:r>
-      <w:proofErr w:type="spellEnd"/>
-      <w:r>
-        <w:rPr>
-          <w:color w:val="000000"/>
-          <w:lang w:eastAsia="zh-CN"/>
-        </w:rPr>
-        <w:t/>
-      </w:r>
-      <w:r>
-        <w:rPr>
-          <w:color w:val="000000"/>
-          <w:lang w:eastAsia="zh-CN"/>
-        </w:rPr>
-        <w:t/>
-      </w:r>
-      <w:r>
-        <w:rPr>
-          <w:color w:val="000000"/>
-          <w:lang w:eastAsia="zh-CN"/>
-        </w:rPr>
-        <w:t/>
-      </w:r>
-      <w:r>
-        <w:rPr>
-          <w:b/>
-          <w:bCs/>
-          <w:color w:val="000000"/>
-          <w:lang w:eastAsia="zh-CN"/>
-        </w:rPr>
-        <w:t/>
-      </w:r>
-      <w:r>
-        <w:rPr>
-          <w:b/>
-          <w:bCs/>
-          <w:color w:val="000000"/>
-          <w:lang w:eastAsia="zh-CN"/>
-        </w:rPr>
-        <w:t/>
-      </w:r>
-      <w:r>
-        <w:rPr>
-          <w:color w:val="000000"/>
-          <w:lang w:eastAsia="zh-CN"/>
-        </w:rPr>
-        <w:t/>
-      </w:r>
-      <w:proofErr w:type="gramStart"/>
-      <w:r>
-        <w:rPr>
-          <w:b/>
-          <w:bCs/>
-          <w:color w:val="000000"/>
-          <w:lang w:eastAsia="zh-CN"/>
-        </w:rPr>
-        <w:t/>
-      </w:r>
-      <w:proofErr w:type="gramEnd"/>
-      <w:r>
-        <w:rPr>
-          <w:b/>
-          <w:bCs/>
-          <w:color w:val="000000"/>
-          <w:lang w:eastAsia="zh-CN"/>
-        </w:rPr>
-        <w:t/>
-      </w:r>
-      <w:r>
-        <w:rPr>
-          <w:color w:val="000000"/>
-          <w:lang w:eastAsia="zh-CN"/>
-        </w:rPr>
-        <w:t/>
-      </w:r>
-      <w:r>
-        <w:rPr>
-          <w:color w:val="000000"/>
-          <w:lang w:eastAsia="zh-CN"/>
-        </w:rPr>
-        <w:t/>
-      </w:r>
-      <w:r>
-        <w:rPr>
-          <w:color w:val="000000"/>
-          <w:lang w:eastAsia="zh-CN"/>
-        </w:rPr>
-        <w:t/>
-      </w:r>
-      <w:r>
-        <w:rPr>
-          <w:color w:val="000000"/>
-          <w:lang w:eastAsia="zh-CN"/>
-        </w:rPr>
-        <w:t/>
-      </w:r>
-      <w:r>
-        <w:rPr>
-          <w:color w:val="000000"/>
-          <w:lang w:eastAsia="zh-CN"/>
-        </w:rPr>
-        <w:t/>
-      </w:r>
-    </w:p>
-    <w:p>
-      <w:pPr>
-        <w:keepNext/>
-        <w:tabs>
-          <w:tab w:val="right" w:pos="10220"/>
-        </w:tabs>
-        <w:spacing w:before="11" w:after="1"/>
-        <w:rPr>
-          <w:lang w:eastAsia="zh-CN"/>
-        </w:rPr>
-      </w:pPr>
-      <w:r>
-        <w:rPr>
-          <w:b/>
-          <w:color w:val="121212"/>
-          <w:lang w:eastAsia="zh-CN"/>
-        </w:rPr>
-        <w:t>[项目名称3]</w:t>
-      </w:r>
-      <w:r>
-        <w:rPr>
-          <w:b/>
-          <w:color w:val="121212"/>
-          <w:lang w:eastAsia="zh-CN"/>
-        </w:rPr>
-        <w:tab/>
-        <w:t>[起止时间]</w:t>
-      </w:r>
-    </w:p>
-    <w:p>
-      <w:pPr>
-        <w:pStyle w:val="a0"/>
-        <w:keepLines/>
-        <w:numPr>
-          <w:ilvl w:val="0"/>
-          <w:numId w:val="0"/>
-        </w:numPr>
-        <w:spacing w:after="1"/>
-        <w:ind w:left="94"/>
-        <w:rPr>
-          <w:lang w:eastAsia="zh-CN"/>
-        </w:rPr>
-      </w:pPr>
-      <w:r>
-        <w:rPr>
-          <w:b/>
-          <w:color w:val="1F4E79"/>
-          <w:lang w:eastAsia="zh-CN"/>
-        </w:rPr>
-        <w:t>项目简介</w:t>
-      </w:r>
-      <w:r>
-        <w:rPr>
-          <w:b/>
-          <w:color w:val="1F4E79"/>
-          <w:lang w:eastAsia="zh-CN"/>
-        </w:rPr>
-        <w:t xml:space="preserve">  </w:t>
-      </w:r>
-      <w:r>
-        <w:rPr>
-          <w:color w:val="000000"/>
-          <w:lang w:eastAsia="zh-CN"/>
-        </w:rPr>
-        <w:t>[问题、方案与个人行动。]</w:t>
-      </w:r>
-      <w:r>
-        <w:rPr>
-          <w:color w:val="000000"/>
-          <w:lang w:eastAsia="zh-CN"/>
-        </w:rPr>
-        <w:t/>
-      </w:r>
-      <w:r>
-        <w:rPr>
-          <w:color w:val="000000"/>
-          <w:lang w:eastAsia="zh-CN"/>
-        </w:rPr>
-        <w:t/>
-      </w:r>
-      <w:r>
-        <w:rPr>
-          <w:rFonts w:hint="eastAsia"/>
-          <w:color w:val="000000"/>
-          <w:lang w:eastAsia="zh-CN"/>
-        </w:rPr>
-        <w:t/>
-      </w:r>
-      <w:r>
-        <w:rPr>
-          <w:color w:val="000000"/>
-          <w:lang w:eastAsia="zh-CN"/>
-        </w:rPr>
-        <w:t/>
-      </w:r>
-    </w:p>
-    <w:p>
-      <w:pPr>
-        <w:pStyle w:val="a0"/>
-        <w:keepLines/>
-        <w:numPr>
-          <w:ilvl w:val="0"/>
-          <w:numId w:val="0"/>
-        </w:numPr>
-        <w:spacing w:after="1"/>
-        <w:ind w:left="94"/>
-        <w:rPr>
-          <w:lang w:eastAsia="zh-CN"/>
-        </w:rPr>
-      </w:pPr>
-      <w:r>
-        <w:rPr>
-          <w:b/>
-          <w:color w:val="1F4E79"/>
-          <w:lang w:eastAsia="zh-CN"/>
-        </w:rPr>
-        <w:t>验证与结果</w:t>
-      </w:r>
-      <w:r>
-        <w:rPr>
-          <w:b/>
-          <w:color w:val="1F4E79"/>
-          <w:lang w:eastAsia="zh-CN"/>
-        </w:rPr>
-        <w:t xml:space="preserve">  </w:t>
-      </w:r>
-      <w:r>
-        <w:rPr>
-          <w:color w:val="000000"/>
-          <w:lang w:eastAsia="zh-CN"/>
-        </w:rPr>
-        <w:t>[真实指标、条件、比较基准和验证方式。]</w:t>
-      </w:r>
-      <w:r>
-        <w:rPr>
-          <w:color w:val="000000"/>
-          <w:lang w:eastAsia="zh-CN"/>
-        </w:rPr>
-        <w:t/>
-      </w:r>
-      <w:r>
-        <w:rPr>
-          <w:rFonts w:hint="eastAsia"/>
-          <w:color w:val="000000"/>
-          <w:lang w:eastAsia="zh-CN"/>
-        </w:rPr>
-        <w:t/>
-      </w:r>
-      <w:r>
-        <w:rPr>
-          <w:color w:val="000000"/>
-          <w:lang w:eastAsia="zh-CN"/>
-        </w:rPr>
-        <w:t/>
-      </w:r>
-      <w:r>
-        <w:rPr>
-          <w:color w:val="000000"/>
-          <w:lang w:eastAsia="zh-CN"/>
-        </w:rPr>
-        <w:t/>
-      </w:r>
-      <w:r>
-        <w:rPr>
-          <w:color w:val="000000"/>
-          <w:lang w:eastAsia="zh-CN"/>
-        </w:rPr>
-        <w:t/>
-      </w:r>
-      <w:r>
-        <w:rPr>
-          <w:b/>
-          <w:color w:val="000000"/>
-          <w:lang w:eastAsia="zh-CN"/>
-        </w:rPr>
-        <w:t/>
-      </w:r>
-      <w:r>
-        <w:rPr>
-          <w:b/>
-          <w:color w:val="000000"/>
-          <w:lang w:eastAsia="zh-CN"/>
-        </w:rPr>
-        <w:t/>
-      </w:r>
-      <w:r>
-        <w:rPr>
-          <w:color w:val="000000"/>
-          <w:lang w:eastAsia="zh-CN"/>
-        </w:rPr>
-        <w:t/>
-      </w:r>
-      <w:r>
-        <w:rPr>
-          <w:color w:val="000000"/>
-          <w:lang w:eastAsia="zh-CN"/>
-        </w:rPr>
-        <w:t/>
-      </w:r>
-      <w:r>
-        <w:rPr>
-          <w:color w:val="000000"/>
-          <w:lang w:eastAsia="zh-CN"/>
-        </w:rPr>
-        <w:t/>
-      </w:r>
-      <w:r>
-        <w:rPr>
-          <w:color w:val="000000"/>
-          <w:lang w:eastAsia="zh-CN"/>
-        </w:rPr>
-        <w:t/>
-      </w:r>
-      <w:r>
-        <w:rPr>
-          <w:color w:val="000000"/>
-          <w:lang w:eastAsia="zh-CN"/>
-        </w:rPr>
-        <w:t/>
-      </w:r>
-      <w:r>
-        <w:rPr>
-          <w:color w:val="000000"/>
-          <w:lang w:eastAsia="zh-CN"/>
-        </w:rPr>
-        <w:t/>
-      </w:r>
-      <w:r>
-        <w:rPr>
-          <w:color w:val="000000"/>
-          <w:lang w:eastAsia="zh-CN"/>
-        </w:rPr>
-        <w:t/>
-      </w:r>
-      <w:r>
-        <w:rPr>
-          <w:color w:val="000000"/>
-          <w:lang w:eastAsia="zh-CN"/>
-        </w:rPr>
-        <w:t/>
-      </w:r>
-      <w:r>
-        <w:rPr>
-          <w:color w:val="000000"/>
-          <w:lang w:eastAsia="zh-CN"/>
-        </w:rPr>
-        <w:t/>
-      </w:r>
-      <w:r>
-        <w:rPr>
-          <w:color w:val="000000"/>
-          <w:lang w:eastAsia="zh-CN"/>
-        </w:rPr>
-        <w:t/>
-      </w:r>
-      <w:r>
-        <w:rPr>
-          <w:color w:val="000000"/>
-          <w:lang w:eastAsia="zh-CN"/>
-        </w:rPr>
-        <w:t/>
-      </w:r>
-      <w:r>
-        <w:rPr>
-          <w:b/>
-          <w:color w:val="000000"/>
-          <w:lang w:eastAsia="zh-CN"/>
-        </w:rPr>
-        <w:t/>
-      </w:r>
-      <w:r>
-        <w:rPr>
-          <w:b/>
-          <w:color w:val="000000"/>
-          <w:lang w:eastAsia="zh-CN"/>
-        </w:rPr>
-        <w:t/>
-      </w:r>
-      <w:r>
-        <w:rPr>
-          <w:color w:val="000000"/>
-          <w:lang w:eastAsia="zh-CN"/>
-        </w:rPr>
-        <w:t/>
+          <w:color w:val="343434"/>
+        </w:rPr>
+        <w:t>[</w:t>
+      </w:r>
+      <w:r>
+        <w:rPr>
+          <w:color w:val="343434"/>
+        </w:rPr>
+        <w:t>项目要点</w:t>
+      </w:r>
+      <w:r>
+        <w:rPr>
+          <w:color w:val="343434"/>
+        </w:rPr>
+        <w:t>2</w:t>
+      </w:r>
+      <w:r>
+        <w:rPr>
+          <w:color w:val="343434"/>
+        </w:rPr>
+        <w:t>：结果、验证方式与使用限制。</w:t>
+      </w:r>
+      <w:r>
+        <w:rPr>
+          <w:color w:val="343434"/>
+        </w:rPr>
+        <w:t>]</w:t>
       </w:r>
     </w:p>
     <w:p>
@@ -3018,7 +1954,6 @@
           <w:b/>
           <w:color w:val="1C4970"/>
           <w:sz w:val="22"/>
-          <w:lang w:eastAsia="zh-CN"/>
         </w:rPr>
         <w:t>▌</w:t>
       </w:r>
@@ -3027,7 +1962,6 @@
           <w:b/>
           <w:color w:val="121212"/>
           <w:sz w:val="23"/>
-          <w:lang w:eastAsia="zh-CN"/>
         </w:rPr>
         <w:t>荣誉奖项</w:t>
       </w:r>
@@ -3042,66 +1976,80 @@
       <w:r>
         <w:rPr>
           <w:color w:val="343434"/>
-          <w:lang w:eastAsia="zh-CN"/>
-        </w:rPr>
-        <w:t>[奖项/证书1]  |  [奖项/证书2]  |  [奖项/证书3]</w:t>
+        </w:rPr>
+        <w:t>[</w:t>
       </w:r>
       <w:r>
         <w:rPr>
           <w:color w:val="343434"/>
-          <w:lang w:eastAsia="zh-CN"/>
-        </w:rPr>
-        <w:t xml:space="preserve"/>
+        </w:rPr>
+        <w:t>奖项</w:t>
       </w:r>
       <w:r>
         <w:rPr>
           <w:color w:val="343434"/>
-          <w:lang w:eastAsia="zh-CN"/>
-        </w:rPr>
-        <w:t/>
+        </w:rPr>
+        <w:t>/</w:t>
       </w:r>
       <w:r>
         <w:rPr>
           <w:color w:val="343434"/>
-          <w:lang w:eastAsia="zh-CN"/>
-        </w:rPr>
-        <w:t/>
+        </w:rPr>
+        <w:t>证书</w:t>
       </w:r>
       <w:r>
         <w:rPr>
           <w:color w:val="343434"/>
-          <w:lang w:eastAsia="zh-CN"/>
-        </w:rPr>
-        <w:t/>
+        </w:rPr>
+        <w:t>1]  |  [</w:t>
       </w:r>
       <w:r>
         <w:rPr>
           <w:color w:val="343434"/>
-          <w:lang w:eastAsia="zh-CN"/>
-        </w:rPr>
-        <w:t xml:space="preserve"/>
+        </w:rPr>
+        <w:t>奖项</w:t>
       </w:r>
       <w:r>
         <w:rPr>
           <w:color w:val="343434"/>
-          <w:lang w:eastAsia="zh-CN"/>
-        </w:rPr>
-        <w:t/>
-      </w:r>
-      <w:r>
-        <w:rPr>
-          <w:rFonts w:hint="eastAsia"/>
+        </w:rPr>
+        <w:t>/</w:t>
+      </w:r>
+      <w:r>
+        <w:rPr>
           <w:color w:val="343434"/>
-          <w:lang w:eastAsia="zh-CN"/>
-        </w:rPr>
-        <w:t/>
+        </w:rPr>
+        <w:t>证书</w:t>
       </w:r>
       <w:r>
         <w:rPr>
           <w:color w:val="343434"/>
-          <w:lang w:eastAsia="zh-CN"/>
-        </w:rPr>
-        <w:t/>
+        </w:rPr>
+        <w:t>2]  |  [</w:t>
+      </w:r>
+      <w:r>
+        <w:rPr>
+          <w:color w:val="343434"/>
+        </w:rPr>
+        <w:t>奖项</w:t>
+      </w:r>
+      <w:r>
+        <w:rPr>
+          <w:color w:val="343434"/>
+        </w:rPr>
+        <w:t>/</w:t>
+      </w:r>
+      <w:r>
+        <w:rPr>
+          <w:color w:val="343434"/>
+        </w:rPr>
+        <w:t>证书</w:t>
+      </w:r>
+      <w:r>
+        <w:rPr>
+          <w:color w:val="343434"/>
+        </w:rPr>
+        <w:t>3]</w:t>
       </w:r>
     </w:p>
     <w:p>
@@ -3112,41 +2060,81 @@
       </w:pPr>
       <w:r>
         <w:rPr>
-          <w:rFonts w:hint="eastAsia"/>
           <w:color w:val="343434"/>
-          <w:lang w:eastAsia="zh-CN"/>
-        </w:rPr>
-        <w:t>[其他荣誉或活动；与JD无关时删除本行]</w:t>
+        </w:rPr>
+        <w:t>[</w:t>
       </w:r>
       <w:r>
         <w:rPr>
           <w:color w:val="343434"/>
-          <w:lang w:eastAsia="zh-CN"/>
-        </w:rPr>
-        <w:t xml:space="preserve"/>
-      </w:r>
-      <w:r>
-        <w:rPr>
-          <w:rFonts w:hint="eastAsia"/>
+        </w:rPr>
+        <w:t>活动</w:t>
+      </w:r>
+      <w:r>
+        <w:rPr>
           <w:color w:val="343434"/>
-          <w:lang w:eastAsia="zh-CN"/>
-        </w:rPr>
-        <w:t/>
+        </w:rPr>
+        <w:t>/</w:t>
       </w:r>
       <w:r>
         <w:rPr>
           <w:color w:val="343434"/>
-          <w:lang w:eastAsia="zh-CN"/>
-        </w:rPr>
-        <w:t xml:space="preserve"/>
-      </w:r>
-      <w:r>
-        <w:rPr>
-          <w:rFonts w:hint="eastAsia"/>
+        </w:rPr>
+        <w:t>奖项</w:t>
+      </w:r>
+      <w:r>
+        <w:rPr>
           <w:color w:val="343434"/>
-          <w:lang w:eastAsia="zh-CN"/>
-        </w:rPr>
-        <w:t/>
+        </w:rPr>
+        <w:t>4]  |  [</w:t>
+      </w:r>
+      <w:r>
+        <w:rPr>
+          <w:color w:val="343434"/>
+        </w:rPr>
+        <w:t>活动</w:t>
+      </w:r>
+      <w:r>
+        <w:rPr>
+          <w:color w:val="343434"/>
+        </w:rPr>
+        <w:t>/</w:t>
+      </w:r>
+      <w:r>
+        <w:rPr>
+          <w:color w:val="343434"/>
+        </w:rPr>
+        <w:t>奖项</w:t>
+      </w:r>
+      <w:r>
+        <w:rPr>
+          <w:color w:val="343434"/>
+        </w:rPr>
+        <w:t>5]  |  [</w:t>
+      </w:r>
+      <w:r>
+        <w:rPr>
+          <w:color w:val="343434"/>
+        </w:rPr>
+        <w:t>活动</w:t>
+      </w:r>
+      <w:r>
+        <w:rPr>
+          <w:color w:val="343434"/>
+        </w:rPr>
+        <w:t>/</w:t>
+      </w:r>
+      <w:r>
+        <w:rPr>
+          <w:color w:val="343434"/>
+        </w:rPr>
+        <w:t>奖项</w:t>
+      </w:r>
+      <w:r>
+        <w:rPr>
+          <w:color w:val="343434"/>
+        </w:rPr>
+        <w:t>6]</w:t>
       </w:r>
     </w:p>
     <w:sectPr>
@@ -3352,7 +2340,7 @@
   <w:abstractNum w:abstractNumId="8" w15:restartNumberingAfterBreak="0">
     <w:nsid w:val="FFFFFF89"/>
     <w:multiLevelType w:val="singleLevel"/>
-    <w:tmpl w:val="29761A62"/>
+    <w:tmpl w:val="5E3CAF9A"/>
     <w:lvl w:ilvl="0">
       <w:start w:val="1"/>
       <w:numFmt w:val="bullet"/>
@@ -3370,31 +2358,31 @@
       </w:rPr>
     </w:lvl>
   </w:abstractNum>
-  <w:num w:numId="1" w16cid:durableId="710765454">
+  <w:num w:numId="1" w16cid:durableId="1509829976">
     <w:abstractNumId w:val="8"/>
   </w:num>
-  <w:num w:numId="2" w16cid:durableId="1834904670">
+  <w:num w:numId="2" w16cid:durableId="634682664">
     <w:abstractNumId w:val="6"/>
   </w:num>
-  <w:num w:numId="3" w16cid:durableId="659962504">
+  <w:num w:numId="3" w16cid:durableId="1916160662">
     <w:abstractNumId w:val="5"/>
   </w:num>
-  <w:num w:numId="4" w16cid:durableId="438914854">
+  <w:num w:numId="4" w16cid:durableId="716971473">
     <w:abstractNumId w:val="4"/>
   </w:num>
-  <w:num w:numId="5" w16cid:durableId="978413810">
+  <w:num w:numId="5" w16cid:durableId="1702045253">
     <w:abstractNumId w:val="7"/>
   </w:num>
-  <w:num w:numId="6" w16cid:durableId="1544630048">
+  <w:num w:numId="6" w16cid:durableId="305355451">
     <w:abstractNumId w:val="3"/>
   </w:num>
-  <w:num w:numId="7" w16cid:durableId="1604416443">
+  <w:num w:numId="7" w16cid:durableId="238171306">
     <w:abstractNumId w:val="2"/>
   </w:num>
-  <w:num w:numId="8" w16cid:durableId="1628856963">
+  <w:num w:numId="8" w16cid:durableId="1753624008">
     <w:abstractNumId w:val="1"/>
   </w:num>
-  <w:num w:numId="9" w16cid:durableId="98794664">
+  <w:num w:numId="9" w16cid:durableId="1860852583">
     <w:abstractNumId w:val="0"/>
   </w:num>
 </w:numbering>
@@ -15101,16 +14089,4 @@
   </a:objectDefaults>
   <a:extraClrSchemeLst/>
 </a:theme>
-</file>
-
-<file path=customXml/item1.xml><?xml version="1.0" encoding="utf-8"?>
-<b:Sources xmlns:b="http://schemas.openxmlformats.org/officeDocument/2006/bibliography" xmlns="http://schemas.openxmlformats.org/officeDocument/2006/bibliography" SelectedStyle="/APA.XSL" StyleName="APA"/>
-</file>
-
-<file path=customXml/itemProps1.xml><?xml version="1.0" encoding="utf-8"?>
-<ds:datastoreItem xmlns:ds="http://schemas.openxmlformats.org/officeDocument/2006/customXml" ds:itemID="{EF278816-EC6F-A645-907D-7F25AECB1D4A}">
-  <ds:schemaRefs>
-    <ds:schemaRef ds:uri="http://schemas.openxmlformats.org/officeDocument/2006/bibliography"/>
-  </ds:schemaRefs>
-</ds:datastoreItem>
 </file>
</xml_diff>